<commit_message>
Add pyannote speaker diarization, voice profiles and speaker naming
- core/diarize.py: pyannoteAI hosted API (diarize, identify with voiceprints,
  voiceprint creation) and optional local pyannote.audio; aligns Whisper word
  timestamps with speaker turns so text is split where the speaker changes.
- core/speakers.py: name suggestions from self-introductions, being addressed,
  elimination and an optional validated LLM pass; apply names everywhere.
- stt.py: word timestamps, speaker engine selection, graceful fallback.
- UI: "Who is who?" panel on the transcript tab, Settings -> Voices tab,
  speaker engine and keys in Settings, upload page status.
- DB: voiceprints table. Tests (79 pass) and documentation updated.
- Fix: stray control characters had replaced \b in a few regexes.

Co-Authored-By: Claude Sonnet 5.5 <noreply@anthropic.com>
</commit_message>
<xml_diff>
--- a/docs/MeetingAI_Project_Guide.docx
+++ b/docs/MeetingAI_Project_Guide.docx
@@ -335,7 +335,16 @@
         <w:t>transcript</w:t>
       </w:r>
       <w:r>
-        <w:t>) with speaker names and timestamps,</w:t>
+        <w:t xml:space="preserve">) with timestamps, and shows </w:t>
+      </w:r>
+      <w:r>
+        <w:rPr>
+          <w:b/>
+        </w:rPr>
+        <w:t>who said what by name</w:t>
+      </w:r>
+      <w:r>
+        <w:t xml:space="preserve"> ("Priya: ...") using pyannote speaker recognition,</w:t>
       </w:r>
     </w:p>
     <w:p>
@@ -769,7 +778,16 @@
               <w:t>Transcript</w:t>
             </w:r>
             <w:r>
-              <w:t xml:space="preserve"> (speaker colours, timestamps, search, audio player), </w:t>
+              <w:t xml:space="preserve"> (speaker colours, timestamps, search, audio player, and the </w:t>
+            </w:r>
+            <w:r>
+              <w:rPr>
+                <w:b/>
+              </w:rPr>
+              <w:t>Who is who?</w:t>
+            </w:r>
+            <w:r>
+              <w:t xml:space="preserve"> panel for naming speakers), </w:t>
             </w:r>
             <w:r>
               <w:rPr>
@@ -1021,7 +1039,16 @@
           <w:p>
             <w:r/>
             <w:r>
-              <w:t>Connect free AI services, set confidence thresholds, set up email, back up and restore data.</w:t>
+              <w:t xml:space="preserve">Connect free AI services, </w:t>
+            </w:r>
+            <w:r>
+              <w:rPr>
+                <w:b/>
+              </w:rPr>
+              <w:t>save team voices (Voices tab)</w:t>
+            </w:r>
+            <w:r>
+              <w:t>, set confidence thresholds, set up email, back up and restore data.</w:t>
             </w:r>
           </w:p>
         </w:tc>
@@ -1703,6 +1730,168 @@
       </w:r>
     </w:p>
     <w:p>
+      <w:pPr>
+        <w:pStyle w:val="Heading2"/>
+      </w:pPr>
+      <w:r>
+        <w:t>4.8 Showing who said what (speaker names)</w:t>
+      </w:r>
+    </w:p>
+    <w:p>
+      <w:r>
+        <w:t xml:space="preserve">Audio has no names in it - a recording is just sound. MeetingAI uses </w:t>
+      </w:r>
+      <w:r>
+        <w:rPr>
+          <w:b/>
+        </w:rPr>
+        <w:t>pyannote</w:t>
+      </w:r>
+      <w:r>
+        <w:t xml:space="preserve"> to work out </w:t>
+      </w:r>
+      <w:r>
+        <w:rPr>
+          <w:i/>
+        </w:rPr>
+        <w:t>which voice is which</w:t>
+      </w:r>
+      <w:r>
+        <w:t xml:space="preserve"> ("Speaker 1", "Speaker 2"...), and then helps you put real names on them in three ways:</w:t>
+      </w:r>
+    </w:p>
+    <w:p>
+      <w:pPr>
+        <w:spacing w:after="40"/>
+        <w:ind w:left="440" w:hanging="320"/>
+      </w:pPr>
+      <w:r>
+        <w:t xml:space="preserve">1.  </w:t>
+      </w:r>
+      <w:r>
+        <w:rPr>
+          <w:b/>
+        </w:rPr>
+        <w:t>Voice profiles (automatic, best).</w:t>
+      </w:r>
+      <w:r>
+        <w:t xml:space="preserve"> Go to </w:t>
+      </w:r>
+      <w:r>
+        <w:rPr>
+          <w:b/>
+        </w:rPr>
+        <w:t>Settings → Voices</w:t>
+      </w:r>
+      <w:r>
+        <w:t xml:space="preserve">, type a person's name and upload (or record) a 5-30 second clip of only that person talking. pyannoteAI turns it into a </w:t>
+      </w:r>
+      <w:r>
+        <w:rPr>
+          <w:i/>
+        </w:rPr>
+        <w:t>voiceprint</w:t>
+      </w:r>
+      <w:r>
+        <w:t xml:space="preserve">. From then on, every new recording that contains that voice shows </w:t>
+      </w:r>
+      <w:r>
+        <w:rPr>
+          <w:b/>
+        </w:rPr>
+        <w:t>their name</w:t>
+      </w:r>
+      <w:r>
+        <w:t xml:space="preserve"> automatically. Voices it does not know stay "Speaker N".</w:t>
+      </w:r>
+    </w:p>
+    <w:p>
+      <w:pPr>
+        <w:spacing w:after="40"/>
+        <w:ind w:left="440" w:hanging="320"/>
+      </w:pPr>
+      <w:r>
+        <w:t xml:space="preserve">2.  </w:t>
+      </w:r>
+      <w:r>
+        <w:rPr>
+          <w:b/>
+        </w:rPr>
+        <w:t>Suggestions from the conversation.</w:t>
+      </w:r>
+      <w:r>
+        <w:t xml:space="preserve"> Open the meeting → </w:t>
+      </w:r>
+      <w:r>
+        <w:rPr>
+          <w:b/>
+        </w:rPr>
+        <w:t>Transcript</w:t>
+      </w:r>
+      <w:r>
+        <w:t xml:space="preserve"> → </w:t>
+      </w:r>
+      <w:r>
+        <w:rPr>
+          <w:b/>
+        </w:rPr>
+        <w:t>Who is who?</w:t>
+      </w:r>
+      <w:r>
+        <w:t xml:space="preserve">. MeetingAI suggests names from what people said - "Hi, I'm Priya", "Rahul, can you give the update?" (then the next voice is Rahul), "Thanks Rahul". Every suggestion shows its evidence and confidence. You can also press </w:t>
+      </w:r>
+      <w:r>
+        <w:rPr>
+          <w:b/>
+        </w:rPr>
+        <w:t>Ask AI for suggestions</w:t>
+      </w:r>
+      <w:r>
+        <w:t>; the AI must quote the exact words that prove a name.</w:t>
+      </w:r>
+    </w:p>
+    <w:p>
+      <w:pPr>
+        <w:spacing w:after="40"/>
+        <w:ind w:left="440" w:hanging="320"/>
+      </w:pPr>
+      <w:r>
+        <w:t xml:space="preserve">3.  </w:t>
+      </w:r>
+      <w:r>
+        <w:rPr>
+          <w:b/>
+        </w:rPr>
+        <w:t>Type it yourself.</w:t>
+      </w:r>
+      <w:r>
+        <w:t xml:space="preserve"> In the same panel, play the short audio sample under each speaker, type the name, and press </w:t>
+      </w:r>
+      <w:r>
+        <w:rPr>
+          <w:b/>
+        </w:rPr>
+        <w:t>Apply names</w:t>
+      </w:r>
+      <w:r>
+        <w:t>. Task owners and the search index are updated too.</w:t>
+      </w:r>
+    </w:p>
+    <w:p>
+      <w:r>
+        <w:t xml:space="preserve">Tip: after naming someone, press </w:t>
+      </w:r>
+      <w:r>
+        <w:rPr>
+          <w:b/>
+        </w:rPr>
+        <w:t>Remember this voice</w:t>
+      </w:r>
+      <w:r>
+        <w:t xml:space="preserve"> to save their voiceprint, so you never have to name them again.</w:t>
+      </w:r>
+    </w:p>
+    <w:p>
       <w:r>
         <w:t>____________________________________________________________</w:t>
       </w:r>
@@ -1790,7 +1979,7 @@
           <w:color w:val="2C3A8C"/>
           <w:sz w:val="17"/>
         </w:rPr>
-        <w:t xml:space="preserve"> 3. SPEECH-TO-TEXT   Whisper turns the audio into text with timestamps</w:t>
+        <w:t xml:space="preserve"> 3. SPEECH-TO-TEXT   Whisper turns the audio into text with WORD timestamps</w:t>
       </w:r>
     </w:p>
     <w:p>
@@ -1804,7 +1993,49 @@
           <w:color w:val="2C3A8C"/>
           <w:sz w:val="17"/>
         </w:rPr>
-        <w:t xml:space="preserve">        |           (AssemblyAI can also label who is speaking)</w:t>
+        <w:t xml:space="preserve">        |</w:t>
+      </w:r>
+    </w:p>
+    <w:p>
+      <w:pPr>
+        <w:spacing w:after="0"/>
+        <w:ind w:left="200"/>
+      </w:pPr>
+      <w:r>
+        <w:rPr>
+          <w:rFonts w:ascii="Consolas" w:hAnsi="Consolas"/>
+          <w:color w:val="2C3A8C"/>
+          <w:sz w:val="17"/>
+        </w:rPr>
+        <w:t xml:space="preserve"> 3b. WHO SPOKE WHEN  pyannote splits the audio into voices (Speaker 1, 2, 3...)</w:t>
+      </w:r>
+    </w:p>
+    <w:p>
+      <w:pPr>
+        <w:spacing w:after="0"/>
+        <w:ind w:left="200"/>
+      </w:pPr>
+      <w:r>
+        <w:rPr>
+          <w:rFonts w:ascii="Consolas" w:hAnsi="Consolas"/>
+          <w:color w:val="2C3A8C"/>
+          <w:sz w:val="17"/>
+        </w:rPr>
+        <w:t xml:space="preserve">        |           saved voice profiles turn voices into NAMES (Priya, Rahul...)</w:t>
+      </w:r>
+    </w:p>
+    <w:p>
+      <w:pPr>
+        <w:spacing w:after="0"/>
+        <w:ind w:left="200"/>
+      </w:pPr>
+      <w:r>
+        <w:rPr>
+          <w:rFonts w:ascii="Consolas" w:hAnsi="Consolas"/>
+          <w:color w:val="2C3A8C"/>
+          <w:sz w:val="17"/>
+        </w:rPr>
+        <w:t xml:space="preserve">        |           every word is given to the speaker who was talking</w:t>
       </w:r>
     </w:p>
     <w:p>
@@ -2593,16 +2824,7 @@
               <w:t>Groq Whisper (large-v3-turbo)</w:t>
             </w:r>
             <w:r>
-              <w:t xml:space="preserve">, </w:t>
-            </w:r>
-            <w:r>
-              <w:rPr>
-                <w:b/>
-              </w:rPr>
-              <w:t>AssemblyAI</w:t>
-            </w:r>
-            <w:r>
-              <w:t xml:space="preserve"> (optional, speaker labels), local Whisper (optional)</w:t>
+              <w:t>, local Whisper (optional)</w:t>
             </w:r>
           </w:p>
         </w:tc>
@@ -2614,6 +2836,74 @@
             <w:r/>
             <w:r>
               <w:t>Whisper is the best open speech model; Groq runs it very fast on a free tier.</w:t>
+            </w:r>
+          </w:p>
+        </w:tc>
+      </w:tr>
+      <w:tr>
+        <w:tc>
+          <w:tcPr>
+            <w:tcW w:type="dxa" w:w="2880"/>
+          </w:tcPr>
+          <w:p>
+            <w:r/>
+            <w:r>
+              <w:t>Who is speaking</w:t>
+            </w:r>
+          </w:p>
+        </w:tc>
+        <w:tc>
+          <w:tcPr>
+            <w:tcW w:type="dxa" w:w="2880"/>
+          </w:tcPr>
+          <w:p>
+            <w:r/>
+            <w:r>
+              <w:rPr>
+                <w:b/>
+              </w:rPr>
+              <w:t>pyannote</w:t>
+            </w:r>
+            <w:r>
+              <w:t xml:space="preserve"> - hosted </w:t>
+            </w:r>
+            <w:r>
+              <w:rPr>
+                <w:b/>
+              </w:rPr>
+              <w:t>pyannoteAI</w:t>
+            </w:r>
+            <w:r>
+              <w:t xml:space="preserve"> API (works on free hosting, can recognise saved voices by name) or </w:t>
+            </w:r>
+            <w:r>
+              <w:rPr>
+                <w:b/>
+              </w:rPr>
+              <w:t>pyannote.audio</w:t>
+            </w:r>
+            <w:r>
+              <w:t xml:space="preserve"> run locally (needs PyTorch + a Hugging Face token); </w:t>
+            </w:r>
+            <w:r>
+              <w:rPr>
+                <w:b/>
+              </w:rPr>
+              <w:t>AssemblyAI</w:t>
+            </w:r>
+            <w:r>
+              <w:t xml:space="preserve"> as an alternative</w:t>
+            </w:r>
+          </w:p>
+        </w:tc>
+        <w:tc>
+          <w:tcPr>
+            <w:tcW w:type="dxa" w:w="2880"/>
+          </w:tcPr>
+          <w:p>
+            <w:r/>
+            <w:r>
+              <w:t>pyannote is the best-known open speaker-diarization toolkit. The hosted API gives its quality without PyTorch's ~2 GB, which the free cloud tier cannot hold.</w:t>
             </w:r>
           </w:p>
         </w:tc>
@@ -2912,7 +3202,238 @@
         <w:pStyle w:val="Heading2"/>
       </w:pPr>
       <w:r>
-        <w:t>6.5 Why no PyTorch?</w:t>
+        <w:t>6.5 Why pyannote - and why through a hosted API?</w:t>
+      </w:r>
+    </w:p>
+    <w:p>
+      <w:r>
+        <w:rPr>
+          <w:b/>
+        </w:rPr>
+        <w:t>pyannote</w:t>
+      </w:r>
+      <w:r>
+        <w:t xml:space="preserve"> is the leading open-source toolkit for </w:t>
+      </w:r>
+      <w:r>
+        <w:rPr>
+          <w:i/>
+        </w:rPr>
+        <w:t>speaker diarization</w:t>
+      </w:r>
+      <w:r>
+        <w:t xml:space="preserve"> ("who spoke when"). Run on your own machine it needs </w:t>
+      </w:r>
+      <w:r>
+        <w:rPr>
+          <w:b/>
+        </w:rPr>
+        <w:t>PyTorch</w:t>
+      </w:r>
+      <w:r>
+        <w:t xml:space="preserve"> (about 2 GB of libraries), a free </w:t>
+      </w:r>
+      <w:r>
+        <w:rPr>
+          <w:b/>
+        </w:rPr>
+        <w:t>Hugging Face token</w:t>
+      </w:r>
+      <w:r>
+        <w:t xml:space="preserve">, and a model licence you must accept. That is fine on a laptop but </w:t>
+      </w:r>
+      <w:r>
+        <w:rPr>
+          <w:b/>
+        </w:rPr>
+        <w:t>does not fit on free hosting</w:t>
+      </w:r>
+      <w:r>
+        <w:t xml:space="preserve"> (about 1 GB of memory).</w:t>
+      </w:r>
+    </w:p>
+    <w:p>
+      <w:r>
+        <w:t>So MeetingAI supports two ways of using pyannote:</w:t>
+      </w:r>
+    </w:p>
+    <w:tbl>
+      <w:tblPr>
+        <w:tblStyle w:val="LightGrid-Accent1"/>
+        <w:tblW w:type="auto" w:w="0"/>
+        <w:tblLook w:firstColumn="1" w:firstRow="1" w:lastColumn="0" w:lastRow="0" w:noHBand="0" w:noVBand="1" w:val="04A0"/>
+      </w:tblPr>
+      <w:tblGrid>
+        <w:gridCol w:w="2880"/>
+        <w:gridCol w:w="2880"/>
+        <w:gridCol w:w="2880"/>
+      </w:tblGrid>
+      <w:tr>
+        <w:tc>
+          <w:tcPr>
+            <w:tcW w:type="dxa" w:w="2880"/>
+          </w:tcPr>
+          <w:p>
+            <w:r/>
+            <w:r>
+              <w:rPr>
+                <w:b/>
+              </w:rPr>
+              <w:t>Way</w:t>
+            </w:r>
+          </w:p>
+        </w:tc>
+        <w:tc>
+          <w:tcPr>
+            <w:tcW w:type="dxa" w:w="2880"/>
+          </w:tcPr>
+          <w:p>
+            <w:r/>
+            <w:r>
+              <w:rPr>
+                <w:b/>
+              </w:rPr>
+              <w:t>Works on Streamlit Cloud?</w:t>
+            </w:r>
+          </w:p>
+        </w:tc>
+        <w:tc>
+          <w:tcPr>
+            <w:tcW w:type="dxa" w:w="2880"/>
+          </w:tcPr>
+          <w:p>
+            <w:r/>
+            <w:r>
+              <w:rPr>
+                <w:b/>
+              </w:rPr>
+              <w:t>Gives names?</w:t>
+            </w:r>
+          </w:p>
+        </w:tc>
+      </w:tr>
+      <w:tr>
+        <w:tc>
+          <w:tcPr>
+            <w:tcW w:type="dxa" w:w="2880"/>
+          </w:tcPr>
+          <w:p>
+            <w:r/>
+            <w:r>
+              <w:rPr>
+                <w:b/>
+              </w:rPr>
+              <w:t>pyannoteAI hosted API</w:t>
+            </w:r>
+            <w:r>
+              <w:t xml:space="preserve"> (</w:t>
+            </w:r>
+            <w:r>
+              <w:rPr>
+                <w:rFonts w:ascii="Consolas" w:hAnsi="Consolas"/>
+              </w:rPr>
+              <w:t>PYANNOTEAI_API_KEY</w:t>
+            </w:r>
+            <w:r>
+              <w:t>)</w:t>
+            </w:r>
+          </w:p>
+        </w:tc>
+        <w:tc>
+          <w:tcPr>
+            <w:tcW w:type="dxa" w:w="2880"/>
+          </w:tcPr>
+          <w:p>
+            <w:r/>
+            <w:r>
+              <w:t>Yes</w:t>
+            </w:r>
+          </w:p>
+        </w:tc>
+        <w:tc>
+          <w:tcPr>
+            <w:tcW w:type="dxa" w:w="2880"/>
+          </w:tcPr>
+          <w:p>
+            <w:r/>
+            <w:r>
+              <w:t>Yes - with saved voice profiles</w:t>
+            </w:r>
+          </w:p>
+        </w:tc>
+      </w:tr>
+      <w:tr>
+        <w:tc>
+          <w:tcPr>
+            <w:tcW w:type="dxa" w:w="2880"/>
+          </w:tcPr>
+          <w:p>
+            <w:r/>
+            <w:r>
+              <w:rPr>
+                <w:b/>
+              </w:rPr>
+              <w:t>pyannote.audio on your own PC</w:t>
+            </w:r>
+            <w:r>
+              <w:t xml:space="preserve"> (</w:t>
+            </w:r>
+            <w:r>
+              <w:rPr>
+                <w:rFonts w:ascii="Consolas" w:hAnsi="Consolas"/>
+              </w:rPr>
+              <w:t>HF_TOKEN</w:t>
+            </w:r>
+            <w:r>
+              <w:t xml:space="preserve"> + </w:t>
+            </w:r>
+            <w:r>
+              <w:rPr>
+                <w:rFonts w:ascii="Consolas" w:hAnsi="Consolas"/>
+              </w:rPr>
+              <w:t>pip install pyannote.audio</w:t>
+            </w:r>
+            <w:r>
+              <w:t>)</w:t>
+            </w:r>
+          </w:p>
+        </w:tc>
+        <w:tc>
+          <w:tcPr>
+            <w:tcW w:type="dxa" w:w="2880"/>
+          </w:tcPr>
+          <w:p>
+            <w:r/>
+            <w:r>
+              <w:t>No</w:t>
+            </w:r>
+          </w:p>
+        </w:tc>
+        <w:tc>
+          <w:tcPr>
+            <w:tcW w:type="dxa" w:w="2880"/>
+          </w:tcPr>
+          <w:p>
+            <w:r/>
+            <w:r>
+              <w:t>Only "Speaker 1/2/3" (you add names)</w:t>
+            </w:r>
+          </w:p>
+        </w:tc>
+      </w:tr>
+    </w:tbl>
+    <w:p/>
+    <w:p>
+      <w:r>
+        <w:t>The app picks automatically (Settings → AI &amp; speech → Speaker engine). If a speaker service fails or runs out of credits, the transcript is still saved - with a single speaker and a clear warning.</w:t>
+      </w:r>
+    </w:p>
+    <w:p>
+      <w:pPr>
+        <w:pStyle w:val="Heading2"/>
+      </w:pPr>
+      <w:r>
+        <w:t>6.6 Why no PyTorch?</w:t>
       </w:r>
     </w:p>
     <w:p>
@@ -3047,7 +3568,31 @@
           <w:p>
             <w:r/>
             <w:r>
-              <w:t>Speaker diarization</w:t>
+              <w:t>Speaker diarization (pyannote)</w:t>
+            </w:r>
+          </w:p>
+        </w:tc>
+      </w:tr>
+      <w:tr>
+        <w:tc>
+          <w:tcPr>
+            <w:tcW w:type="dxa" w:w="4320"/>
+          </w:tcPr>
+          <w:p>
+            <w:r/>
+            <w:r>
+              <w:t>"Speaker B" -&gt; "Priya"</w:t>
+            </w:r>
+          </w:p>
+        </w:tc>
+        <w:tc>
+          <w:tcPr>
+            <w:tcW w:type="dxa" w:w="4320"/>
+          </w:tcPr>
+          <w:p>
+            <w:r/>
+            <w:r>
+              <w:t>Speaker identification (voiceprints) + name inference from the text (self-introductions, being addressed)</w:t>
             </w:r>
           </w:p>
         </w:tc>
@@ -3530,6 +4075,259 @@
     <w:p>
       <w:r>
         <w:t>And we never trust them blindly (section 9).</w:t>
+      </w:r>
+    </w:p>
+    <w:p>
+      <w:pPr>
+        <w:pStyle w:val="Heading2"/>
+      </w:pPr>
+      <w:r>
+        <w:t>7.4 Speaker diarization and speaker names, step by step</w:t>
+      </w:r>
+    </w:p>
+    <w:p>
+      <w:pPr>
+        <w:spacing w:after="40"/>
+        <w:ind w:left="440" w:hanging="320"/>
+      </w:pPr>
+      <w:r>
+        <w:t xml:space="preserve">1.  </w:t>
+      </w:r>
+      <w:r>
+        <w:rPr>
+          <w:b/>
+        </w:rPr>
+        <w:t>Word timestamps.</w:t>
+      </w:r>
+      <w:r>
+        <w:t xml:space="preserve"> Whisper returns every word with its start and end time.</w:t>
+      </w:r>
+    </w:p>
+    <w:p>
+      <w:pPr>
+        <w:spacing w:after="40"/>
+        <w:ind w:left="440" w:hanging="320"/>
+      </w:pPr>
+      <w:r>
+        <w:t xml:space="preserve">2.  </w:t>
+      </w:r>
+      <w:r>
+        <w:rPr>
+          <w:b/>
+        </w:rPr>
+        <w:t>Diarization.</w:t>
+      </w:r>
+      <w:r>
+        <w:t xml:space="preserve"> pyannote listens to the whole recording and returns </w:t>
+      </w:r>
+      <w:r>
+        <w:rPr>
+          <w:i/>
+        </w:rPr>
+        <w:t>turns</w:t>
+      </w:r>
+      <w:r>
+        <w:t xml:space="preserve">: </w:t>
+      </w:r>
+      <w:r>
+        <w:rPr>
+          <w:rFonts w:ascii="Consolas" w:hAnsi="Consolas"/>
+        </w:rPr>
+        <w:t>Speaker 1: 0.0-3.2 s</w:t>
+      </w:r>
+      <w:r>
+        <w:t xml:space="preserve">, </w:t>
+      </w:r>
+      <w:r>
+        <w:rPr>
+          <w:rFonts w:ascii="Consolas" w:hAnsi="Consolas"/>
+        </w:rPr>
+        <w:t>Speaker 2: 3.4-9.0 s</w:t>
+      </w:r>
+      <w:r>
+        <w:t>...</w:t>
+      </w:r>
+    </w:p>
+    <w:p>
+      <w:pPr>
+        <w:spacing w:after="40"/>
+        <w:ind w:left="440" w:hanging="320"/>
+      </w:pPr>
+      <w:r>
+        <w:t xml:space="preserve">3.  </w:t>
+      </w:r>
+      <w:r>
+        <w:rPr>
+          <w:b/>
+        </w:rPr>
+        <w:t>Alignment</w:t>
+      </w:r>
+      <w:r>
+        <w:t xml:space="preserve"> (</w:t>
+      </w:r>
+      <w:r>
+        <w:rPr>
+          <w:rFonts w:ascii="Consolas" w:hAnsi="Consolas"/>
+        </w:rPr>
+        <w:t>core/diarize.py</w:t>
+      </w:r>
+      <w:r>
+        <w:t xml:space="preserve"> -&gt; </w:t>
+      </w:r>
+      <w:r>
+        <w:rPr>
+          <w:rFonts w:ascii="Consolas" w:hAnsi="Consolas"/>
+        </w:rPr>
+        <w:t>assign_speakers</w:t>
+      </w:r>
+      <w:r>
+        <w:t>). Each word is handed to the speaker whose turn contains the word's midpoint. A sentence is split exactly where the speaker changes. One-word interruptions ("yeah") do not break a turn in pieces.</w:t>
+      </w:r>
+    </w:p>
+    <w:p>
+      <w:pPr>
+        <w:spacing w:after="40"/>
+        <w:ind w:left="440" w:hanging="320"/>
+      </w:pPr>
+      <w:r>
+        <w:t xml:space="preserve">4.  </w:t>
+      </w:r>
+      <w:r>
+        <w:rPr>
+          <w:b/>
+        </w:rPr>
+        <w:t>Voice matching (optional).</w:t>
+      </w:r>
+      <w:r>
+        <w:t xml:space="preserve"> If you saved voice profiles, MeetingAI asks pyannoteAI's </w:t>
+      </w:r>
+      <w:r>
+        <w:rPr>
+          <w:i/>
+        </w:rPr>
+        <w:t>identify</w:t>
+      </w:r>
+      <w:r>
+        <w:t xml:space="preserve"> job to compare each voice with the voiceprints. A voice that matches well enough (default strictness 60 out of 100) gets the </w:t>
+      </w:r>
+      <w:r>
+        <w:rPr>
+          <w:b/>
+        </w:rPr>
+        <w:t>name</w:t>
+      </w:r>
+      <w:r>
+        <w:t>; the rest remain Speaker N.</w:t>
+      </w:r>
+    </w:p>
+    <w:p>
+      <w:pPr>
+        <w:spacing w:after="40"/>
+        <w:ind w:left="440" w:hanging="320"/>
+      </w:pPr>
+      <w:r>
+        <w:t xml:space="preserve">5.  </w:t>
+      </w:r>
+      <w:r>
+        <w:rPr>
+          <w:b/>
+        </w:rPr>
+        <w:t>Name suggestions</w:t>
+      </w:r>
+      <w:r>
+        <w:t xml:space="preserve"> (</w:t>
+      </w:r>
+      <w:r>
+        <w:rPr>
+          <w:rFonts w:ascii="Consolas" w:hAnsi="Consolas"/>
+        </w:rPr>
+        <w:t>core/speakers.py</w:t>
+      </w:r>
+      <w:r>
+        <w:t>) for anonymous voices, from the transcript:</w:t>
+      </w:r>
+    </w:p>
+    <w:p>
+      <w:pPr>
+        <w:pStyle w:val="ListBullet"/>
+      </w:pPr>
+      <w:r>
+        <w:rPr>
+          <w:i/>
+        </w:rPr>
+        <w:t>self-introduction</w:t>
+      </w:r>
+      <w:r>
+        <w:t xml:space="preserve"> ("I'm Priya") - strong evidence,</w:t>
+      </w:r>
+    </w:p>
+    <w:p>
+      <w:pPr>
+        <w:pStyle w:val="ListBullet"/>
+      </w:pPr>
+      <w:r>
+        <w:rPr>
+          <w:i/>
+        </w:rPr>
+        <w:t>being addressed</w:t>
+      </w:r>
+      <w:r>
+        <w:t xml:space="preserve"> ("Rahul, can you..." makes the next voice Rahul; "Thanks Rahul" makes the previous voice Rahul) - medium,</w:t>
+      </w:r>
+    </w:p>
+    <w:p>
+      <w:pPr>
+        <w:pStyle w:val="ListBullet"/>
+      </w:pPr>
+      <w:r>
+        <w:rPr>
+          <w:i/>
+        </w:rPr>
+        <w:t>elimination</w:t>
+      </w:r>
+      <w:r>
+        <w:t xml:space="preserve"> (one unnamed voice and one unused attendee) - weak,</w:t>
+      </w:r>
+    </w:p>
+    <w:p>
+      <w:pPr>
+        <w:pStyle w:val="ListBullet"/>
+      </w:pPr>
+      <w:r>
+        <w:rPr>
+          <w:i/>
+        </w:rPr>
+        <w:t>LLM</w:t>
+      </w:r>
+      <w:r>
+        <w:t xml:space="preserve"> (optional) - must quote exact words and the name must be an attendee or appear in the transcript.</w:t>
+      </w:r>
+    </w:p>
+    <w:p>
+      <w:pPr>
+        <w:spacing w:after="40"/>
+        <w:ind w:left="440" w:hanging="320"/>
+      </w:pPr>
+      <w:r>
+        <w:t xml:space="preserve">1.  </w:t>
+      </w:r>
+      <w:r>
+        <w:rPr>
+          <w:b/>
+        </w:rPr>
+        <w:t>You confirm.</w:t>
+      </w:r>
+      <w:r>
+        <w:t xml:space="preserve"> Suggestions are never applied silently. </w:t>
+      </w:r>
+      <w:r>
+        <w:rPr>
+          <w:b/>
+        </w:rPr>
+        <w:t>Apply names</w:t>
+      </w:r>
+      <w:r>
+        <w:t xml:space="preserve"> renames the transcript, task owners, decisions and the attendee list, and refreshes the search index.</w:t>
       </w:r>
     </w:p>
     <w:p>
@@ -4668,7 +5466,7 @@
         <w:pStyle w:val="ListBullet"/>
       </w:pPr>
       <w:r>
-        <w:t>Audio you transcribe goes to Groq or AssemblyAI.</w:t>
+        <w:t>Audio you transcribe goes to Groq (text) and, if speaker recognition is on, to pyannoteAI (or AssemblyAI). Local pyannote keeps audio on your machine.</w:t>
       </w:r>
     </w:p>
     <w:p>
@@ -4676,6 +5474,20 @@
         <w:pStyle w:val="ListBullet"/>
       </w:pPr>
       <w:r>
+        <w:rPr>
+          <w:b/>
+        </w:rPr>
+        <w:t>Voiceprints</w:t>
+      </w:r>
+      <w:r>
+        <w:t xml:space="preserve"> (the voice fingerprints) are stored in your own database. pyannoteAI does not keep them for you. Only create a voice profile for someone who agreed to it, and delete it from Settings → Voices any time.</w:t>
+      </w:r>
+    </w:p>
+    <w:p>
+      <w:pPr>
+        <w:pStyle w:val="ListBullet"/>
+      </w:pPr>
+      <w:r>
         <w:t xml:space="preserve">Transcript text goes to Groq / Gemini / OpenRouter when the LLM is used. You can turn this off in </w:t>
       </w:r>
       <w:r>
@@ -4772,6 +5584,15 @@
       </w:r>
       <w:r>
         <w:t xml:space="preserve"> search index), </w:t>
+      </w:r>
+      <w:r>
+        <w:rPr>
+          <w:rFonts w:ascii="Consolas" w:hAnsi="Consolas"/>
+        </w:rPr>
+        <w:t>voiceprints</w:t>
+      </w:r>
+      <w:r>
+        <w:t xml:space="preserve">, </w:t>
       </w:r>
       <w:r>
         <w:rPr>
@@ -5068,7 +5889,7 @@
           <w:color w:val="2C3A8C"/>
           <w:sz w:val="17"/>
         </w:rPr>
-        <w:t>│   ├─ stt.py              Speech-to-text (FFmpeg, Groq, AssemblyAI, local Whisper)</w:t>
+        <w:t>│   ├─ stt.py              Speech-to-text (FFmpeg, Groq, AssemblyAI, local Whisper) + word timestamps</w:t>
       </w:r>
     </w:p>
     <w:p>
@@ -5082,7 +5903,7 @@
           <w:color w:val="2C3A8C"/>
           <w:sz w:val="17"/>
         </w:rPr>
-        <w:t>│   ├─ dates.py            Finds and converts "next Friday", "end of month"...</w:t>
+        <w:t>│   ├─ diarize.py          pyannote: who spoke when, voice profiles, aligning words to speakers</w:t>
       </w:r>
     </w:p>
     <w:p>
@@ -5096,7 +5917,7 @@
           <w:color w:val="2C3A8C"/>
           <w:sz w:val="17"/>
         </w:rPr>
-        <w:t>│   ├─ seed_data.py        Training and test sentences for the classifier</w:t>
+        <w:t>│   ├─ speakers.py         Name suggestions for anonymous speakers and applying names</w:t>
       </w:r>
     </w:p>
     <w:p>
@@ -5110,7 +5931,7 @@
           <w:color w:val="2C3A8C"/>
           <w:sz w:val="17"/>
         </w:rPr>
-        <w:t>│   ├─ nlp.py              Cleaning, rules, Naive Bayes, owner / deadline / event extraction</w:t>
+        <w:t>│   ├─ dates.py            Finds and converts "next Friday", "end of month"...</w:t>
       </w:r>
     </w:p>
     <w:p>
@@ -5124,7 +5945,7 @@
           <w:color w:val="2C3A8C"/>
           <w:sz w:val="17"/>
         </w:rPr>
-        <w:t>│   ├─ gateway.py          The confidence gateway and reason codes</w:t>
+        <w:t>│   ├─ seed_data.py        Training and test sentences for the classifier</w:t>
       </w:r>
     </w:p>
     <w:p>
@@ -5138,7 +5959,7 @@
           <w:color w:val="2C3A8C"/>
           <w:sz w:val="17"/>
         </w:rPr>
-        <w:t>│   ├─ llm.py              Free-LLM router with fallback</w:t>
+        <w:t>│   ├─ nlp.py              Cleaning, rules, Naive Bayes, owner / deadline / event extraction</w:t>
       </w:r>
     </w:p>
     <w:p>
@@ -5152,7 +5973,7 @@
           <w:color w:val="2C3A8C"/>
           <w:sz w:val="17"/>
         </w:rPr>
-        <w:t>│   ├─ llm_tasks.py        The prompts given to the LLM and how answers are parsed</w:t>
+        <w:t>│   ├─ gateway.py          The confidence gateway and reason codes</w:t>
       </w:r>
     </w:p>
     <w:p>
@@ -5166,7 +5987,7 @@
           <w:color w:val="2C3A8C"/>
           <w:sz w:val="17"/>
         </w:rPr>
-        <w:t>│   ├─ pipeline.py         Orchestrates everything for one meeting + validation</w:t>
+        <w:t>│   ├─ llm.py              Free-LLM router with fallback</w:t>
       </w:r>
     </w:p>
     <w:p>
@@ -5180,7 +6001,7 @@
           <w:color w:val="2C3A8C"/>
           <w:sz w:val="17"/>
         </w:rPr>
-        <w:t>│   ├─ rag.py              ChromaDB index, hybrid search, query router, grounded answers</w:t>
+        <w:t>│   ├─ llm_tasks.py        The prompts given to the LLM and how answers are parsed</w:t>
       </w:r>
     </w:p>
     <w:p>
@@ -5194,7 +6015,7 @@
           <w:color w:val="2C3A8C"/>
           <w:sz w:val="17"/>
         </w:rPr>
-        <w:t>│   ├─ mom.py              Minutes of Meeting (Markdown / HTML / Word / PDF)</w:t>
+        <w:t>│   ├─ pipeline.py         Orchestrates everything for one meeting + validation</w:t>
       </w:r>
     </w:p>
     <w:p>
@@ -5208,7 +6029,7 @@
           <w:color w:val="2C3A8C"/>
           <w:sz w:val="17"/>
         </w:rPr>
-        <w:t>│   ├─ mailer.py           Email sending (SMTP)</w:t>
+        <w:t>│   ├─ rag.py              ChromaDB index, hybrid search, query router, grounded answers</w:t>
       </w:r>
     </w:p>
     <w:p>
@@ -5222,7 +6043,7 @@
           <w:color w:val="2C3A8C"/>
           <w:sz w:val="17"/>
         </w:rPr>
-        <w:t>│   ├─ ics.py              Calendar files and Google Calendar links</w:t>
+        <w:t>│   ├─ mom.py              Minutes of Meeting (Markdown / HTML / Word / PDF)</w:t>
       </w:r>
     </w:p>
     <w:p>
@@ -5236,7 +6057,7 @@
           <w:color w:val="2C3A8C"/>
           <w:sz w:val="17"/>
         </w:rPr>
-        <w:t>│   ├─ followups.py        Draft reminders and messages</w:t>
+        <w:t>│   ├─ mailer.py           Email sending (SMTP)</w:t>
       </w:r>
     </w:p>
     <w:p>
@@ -5250,7 +6071,7 @@
           <w:color w:val="2C3A8C"/>
           <w:sz w:val="17"/>
         </w:rPr>
-        <w:t>│   └─ demo.py             Three sample meetings</w:t>
+        <w:t>│   ├─ ics.py              Calendar files and Google Calendar links</w:t>
       </w:r>
     </w:p>
     <w:p>
@@ -5264,7 +6085,7 @@
           <w:color w:val="2C3A8C"/>
           <w:sz w:val="17"/>
         </w:rPr>
-        <w:t>├─ ui/</w:t>
+        <w:t>│   ├─ followups.py        Draft reminders and messages</w:t>
       </w:r>
     </w:p>
     <w:p>
@@ -5278,7 +6099,7 @@
           <w:color w:val="2C3A8C"/>
           <w:sz w:val="17"/>
         </w:rPr>
-        <w:t>│   ├─ theme.py            All the CSS (colours, cards, animations)</w:t>
+        <w:t>│   └─ demo.py             Three sample meetings</w:t>
       </w:r>
     </w:p>
     <w:p>
@@ -5292,7 +6113,7 @@
           <w:color w:val="2C3A8C"/>
           <w:sz w:val="17"/>
         </w:rPr>
-        <w:t>│   ├─ components.py       Reusable HTML pieces (cards, chips, transcript, calendar grid)</w:t>
+        <w:t>├─ ui/</w:t>
       </w:r>
     </w:p>
     <w:p>
@@ -5306,7 +6127,7 @@
           <w:color w:val="2C3A8C"/>
           <w:sz w:val="17"/>
         </w:rPr>
-        <w:t>│   ├─ charts.py           Themed Plotly charts</w:t>
+        <w:t>│   ├─ theme.py            All the CSS (colours, cards, animations)</w:t>
       </w:r>
     </w:p>
     <w:p>
@@ -5320,7 +6141,7 @@
           <w:color w:val="2C3A8C"/>
           <w:sz w:val="17"/>
         </w:rPr>
-        <w:t>│   └─ nav.py              Navigation helpers</w:t>
+        <w:t>│   ├─ components.py       Reusable HTML pieces (cards, chips, transcript, calendar grid)</w:t>
       </w:r>
     </w:p>
     <w:p>
@@ -5334,7 +6155,7 @@
           <w:color w:val="2C3A8C"/>
           <w:sz w:val="17"/>
         </w:rPr>
-        <w:t>├─ views/                  One file per page</w:t>
+        <w:t>│   ├─ charts.py           Themed Plotly charts</w:t>
       </w:r>
     </w:p>
     <w:p>
@@ -5348,7 +6169,7 @@
           <w:color w:val="2C3A8C"/>
           <w:sz w:val="17"/>
         </w:rPr>
-        <w:t>│   ├─ dashboard.py  upload.py  library.py  meeting.py  chat.py  search.py</w:t>
+        <w:t>│   └─ nav.py              Navigation helpers</w:t>
       </w:r>
     </w:p>
     <w:p>
@@ -5362,7 +6183,7 @@
           <w:color w:val="2C3A8C"/>
           <w:sz w:val="17"/>
         </w:rPr>
-        <w:t>│   ├─ tracker.py  calendar.py  mom.py  followups.py  nlplab.py  settings.py</w:t>
+        <w:t>├─ views/                  One file per page</w:t>
       </w:r>
     </w:p>
     <w:p>
@@ -5376,7 +6197,7 @@
           <w:color w:val="2C3A8C"/>
           <w:sz w:val="17"/>
         </w:rPr>
-        <w:t>│   └─ _tasks.py           Editable task table used by two pages</w:t>
+        <w:t>│   ├─ dashboard.py  upload.py  library.py  meeting.py  chat.py  search.py</w:t>
       </w:r>
     </w:p>
     <w:p>
@@ -5390,7 +6211,7 @@
           <w:color w:val="2C3A8C"/>
           <w:sz w:val="17"/>
         </w:rPr>
-        <w:t>├─ tests/                  60 automated tests</w:t>
+        <w:t>│   ├─ tracker.py  calendar.py  mom.py  followups.py  nlplab.py  settings.py</w:t>
       </w:r>
     </w:p>
     <w:p>
@@ -5404,46 +6225,7 @@
           <w:color w:val="2C3A8C"/>
           <w:sz w:val="17"/>
         </w:rPr>
-        <w:t>└─ docs/                   This guide</w:t>
-      </w:r>
-    </w:p>
-    <w:p/>
-    <w:p>
-      <w:r>
-        <w:t>____________________________________________________________</w:t>
-      </w:r>
-    </w:p>
-    <w:p>
-      <w:pPr>
-        <w:pStyle w:val="Heading1"/>
-      </w:pPr>
-      <w:r>
-        <w:rPr>
-          <w:color w:val="2C3A8C"/>
-        </w:rPr>
-        <w:t>13. Setting it up on your own computer</w:t>
-      </w:r>
-    </w:p>
-    <w:p>
-      <w:r>
-        <w:t xml:space="preserve">You need </w:t>
-      </w:r>
-      <w:r>
-        <w:rPr>
-          <w:b/>
-        </w:rPr>
-        <w:t>Python 3.10 or newer</w:t>
-      </w:r>
-      <w:r>
-        <w:t xml:space="preserve"> (3.11 recommended).</w:t>
-      </w:r>
-    </w:p>
-    <w:p>
-      <w:pPr>
-        <w:pStyle w:val="Heading2"/>
-      </w:pPr>
-      <w:r>
-        <w:t>Windows (PowerShell)</w:t>
+        <w:t>│   ├─ _tasks.py           Editable task table used by two pages</w:t>
       </w:r>
     </w:p>
     <w:p>
@@ -5457,7 +6239,7 @@
           <w:color w:val="2C3A8C"/>
           <w:sz w:val="17"/>
         </w:rPr>
-        <w:t>cd "C:\Users\Nidhi\Desktop\SEM 3\nlp+agentic ai"</w:t>
+        <w:t>│   ├─ _speakers.py        The 'Who is who?' panel (naming speakers, saving voices)</w:t>
       </w:r>
     </w:p>
     <w:p>
@@ -5471,7 +6253,7 @@
           <w:color w:val="2C3A8C"/>
           <w:sz w:val="17"/>
         </w:rPr>
-        <w:t>python -m venv .venv</w:t>
+        <w:t>│   └─ _email.py           'Connect your email' panel</w:t>
       </w:r>
     </w:p>
     <w:p>
@@ -5485,7 +6267,7 @@
           <w:color w:val="2C3A8C"/>
           <w:sz w:val="17"/>
         </w:rPr>
-        <w:t>.venv\Scripts\activate</w:t>
+        <w:t>├─ tests/                  79 automated tests</w:t>
       </w:r>
     </w:p>
     <w:p>
@@ -5499,7 +6281,46 @@
           <w:color w:val="2C3A8C"/>
           <w:sz w:val="17"/>
         </w:rPr>
-        <w:t>pip install -r requirements.txt</w:t>
+        <w:t>└─ docs/                   This guide</w:t>
+      </w:r>
+    </w:p>
+    <w:p/>
+    <w:p>
+      <w:r>
+        <w:t>____________________________________________________________</w:t>
+      </w:r>
+    </w:p>
+    <w:p>
+      <w:pPr>
+        <w:pStyle w:val="Heading1"/>
+      </w:pPr>
+      <w:r>
+        <w:rPr>
+          <w:color w:val="2C3A8C"/>
+        </w:rPr>
+        <w:t>13. Setting it up on your own computer</w:t>
+      </w:r>
+    </w:p>
+    <w:p>
+      <w:r>
+        <w:t xml:space="preserve">You need </w:t>
+      </w:r>
+      <w:r>
+        <w:rPr>
+          <w:b/>
+        </w:rPr>
+        <w:t>Python 3.10 or newer</w:t>
+      </w:r>
+      <w:r>
+        <w:t xml:space="preserve"> (3.11 recommended).</w:t>
+      </w:r>
+    </w:p>
+    <w:p>
+      <w:pPr>
+        <w:pStyle w:val="Heading2"/>
+      </w:pPr>
+      <w:r>
+        <w:t>Windows (PowerShell)</w:t>
       </w:r>
     </w:p>
     <w:p>
@@ -5513,7 +6334,7 @@
           <w:color w:val="2C3A8C"/>
           <w:sz w:val="17"/>
         </w:rPr>
-        <w:t>winget install Gyan.FFmpeg</w:t>
+        <w:t>cd "C:\Users\Nidhi\Desktop\SEM 3\nlp+agentic ai"</w:t>
       </w:r>
     </w:p>
     <w:p>
@@ -5527,21 +6348,7 @@
           <w:color w:val="2C3A8C"/>
           <w:sz w:val="17"/>
         </w:rPr>
-        <w:t>streamlit run app.py</w:t>
-      </w:r>
-    </w:p>
-    <w:p/>
-    <w:p>
-      <w:r>
-        <w:t>(FFmpeg is only needed for audio/video. Close and reopen PowerShell after installing it.)</w:t>
-      </w:r>
-    </w:p>
-    <w:p>
-      <w:pPr>
-        <w:pStyle w:val="Heading2"/>
-      </w:pPr>
-      <w:r>
-        <w:t>Mac / Linux</w:t>
+        <w:t>python -m venv .venv</w:t>
       </w:r>
     </w:p>
     <w:p>
@@ -5555,7 +6362,7 @@
           <w:color w:val="2C3A8C"/>
           <w:sz w:val="17"/>
         </w:rPr>
-        <w:t>python3 -m venv .venv</w:t>
+        <w:t>.venv\Scripts\activate</w:t>
       </w:r>
     </w:p>
     <w:p>
@@ -5569,7 +6376,7 @@
           <w:color w:val="2C3A8C"/>
           <w:sz w:val="17"/>
         </w:rPr>
-        <w:t>source .venv/bin/activate</w:t>
+        <w:t>pip install -r requirements.txt</w:t>
       </w:r>
     </w:p>
     <w:p>
@@ -5583,7 +6390,7 @@
           <w:color w:val="2C3A8C"/>
           <w:sz w:val="17"/>
         </w:rPr>
-        <w:t>pip install -r requirements.txt</w:t>
+        <w:t>winget install Gyan.FFmpeg</w:t>
       </w:r>
     </w:p>
     <w:p>
@@ -5597,7 +6404,21 @@
           <w:color w:val="2C3A8C"/>
           <w:sz w:val="17"/>
         </w:rPr>
-        <w:t>brew install ffmpeg        # or: sudo apt install ffmpeg</w:t>
+        <w:t>streamlit run app.py</w:t>
+      </w:r>
+    </w:p>
+    <w:p/>
+    <w:p>
+      <w:r>
+        <w:t>(FFmpeg is only needed for audio/video. Close and reopen PowerShell after installing it.)</w:t>
+      </w:r>
+    </w:p>
+    <w:p>
+      <w:pPr>
+        <w:pStyle w:val="Heading2"/>
+      </w:pPr>
+      <w:r>
+        <w:t>Mac / Linux</w:t>
       </w:r>
     </w:p>
     <w:p>
@@ -5611,6 +6432,62 @@
           <w:color w:val="2C3A8C"/>
           <w:sz w:val="17"/>
         </w:rPr>
+        <w:t>python3 -m venv .venv</w:t>
+      </w:r>
+    </w:p>
+    <w:p>
+      <w:pPr>
+        <w:spacing w:after="0"/>
+        <w:ind w:left="200"/>
+      </w:pPr>
+      <w:r>
+        <w:rPr>
+          <w:rFonts w:ascii="Consolas" w:hAnsi="Consolas"/>
+          <w:color w:val="2C3A8C"/>
+          <w:sz w:val="17"/>
+        </w:rPr>
+        <w:t>source .venv/bin/activate</w:t>
+      </w:r>
+    </w:p>
+    <w:p>
+      <w:pPr>
+        <w:spacing w:after="0"/>
+        <w:ind w:left="200"/>
+      </w:pPr>
+      <w:r>
+        <w:rPr>
+          <w:rFonts w:ascii="Consolas" w:hAnsi="Consolas"/>
+          <w:color w:val="2C3A8C"/>
+          <w:sz w:val="17"/>
+        </w:rPr>
+        <w:t>pip install -r requirements.txt</w:t>
+      </w:r>
+    </w:p>
+    <w:p>
+      <w:pPr>
+        <w:spacing w:after="0"/>
+        <w:ind w:left="200"/>
+      </w:pPr>
+      <w:r>
+        <w:rPr>
+          <w:rFonts w:ascii="Consolas" w:hAnsi="Consolas"/>
+          <w:color w:val="2C3A8C"/>
+          <w:sz w:val="17"/>
+        </w:rPr>
+        <w:t>brew install ffmpeg        # or: sudo apt install ffmpeg</w:t>
+      </w:r>
+    </w:p>
+    <w:p>
+      <w:pPr>
+        <w:spacing w:after="0"/>
+        <w:ind w:left="200"/>
+      </w:pPr>
+      <w:r>
+        <w:rPr>
+          <w:rFonts w:ascii="Consolas" w:hAnsi="Consolas"/>
+          <w:color w:val="2C3A8C"/>
+          <w:sz w:val="17"/>
+        </w:rPr>
         <w:t>streamlit run app.py</w:t>
       </w:r>
     </w:p>
@@ -5627,6 +6504,61 @@
       </w:r>
       <w:r>
         <w:t>. The first time you analyse a meeting, the small embedding model (about 80 MB) downloads automatically.</w:t>
+      </w:r>
+    </w:p>
+    <w:p>
+      <w:pPr>
+        <w:pStyle w:val="Heading2"/>
+      </w:pPr>
+      <w:r>
+        <w:t>Optional: run pyannote on your own PC (no hosted API)</w:t>
+      </w:r>
+    </w:p>
+    <w:p>
+      <w:pPr>
+        <w:spacing w:after="0"/>
+        <w:ind w:left="200"/>
+      </w:pPr>
+      <w:r>
+        <w:rPr>
+          <w:rFonts w:ascii="Consolas" w:hAnsi="Consolas"/>
+          <w:color w:val="2C3A8C"/>
+          <w:sz w:val="17"/>
+        </w:rPr>
+        <w:t>pip install -r requirements-local.txt</w:t>
+      </w:r>
+    </w:p>
+    <w:p/>
+    <w:p>
+      <w:r>
+        <w:t xml:space="preserve">Then create a free token at huggingface.co/settings/tokens, </w:t>
+      </w:r>
+      <w:r>
+        <w:rPr>
+          <w:b/>
+        </w:rPr>
+        <w:t>accept the model terms</w:t>
+      </w:r>
+      <w:r>
+        <w:t xml:space="preserve"> on the pages huggingface.co/pyannote/speaker-diarization-3.1 and huggingface.co/pyannote/segmentation-3.0, and set </w:t>
+      </w:r>
+      <w:r>
+        <w:rPr>
+          <w:rFonts w:ascii="Consolas" w:hAnsi="Consolas"/>
+        </w:rPr>
+        <w:t>HF_TOKEN</w:t>
+      </w:r>
+      <w:r>
+        <w:t xml:space="preserve">. Local pyannote gives "Speaker 1/2/3" labels (naming is then done in the </w:t>
+      </w:r>
+      <w:r>
+        <w:rPr>
+          <w:b/>
+        </w:rPr>
+        <w:t>Who is who?</w:t>
+      </w:r>
+      <w:r>
+        <w:t xml:space="preserve"> panel). It is slow on CPU and cannot run on the free Streamlit Cloud tier.</w:t>
       </w:r>
     </w:p>
     <w:p>
@@ -5918,6 +6850,106 @@
               <w:rPr>
                 <w:b/>
               </w:rPr>
+              <w:t>pyannoteAI</w:t>
+            </w:r>
+            <w:r>
+              <w:t xml:space="preserve"> (recommended for speaker names)</w:t>
+            </w:r>
+          </w:p>
+        </w:tc>
+        <w:tc>
+          <w:tcPr>
+            <w:tcW w:type="dxa" w:w="2880"/>
+          </w:tcPr>
+          <w:p>
+            <w:r/>
+            <w:r>
+              <w:t>pyannote speaker separation and voice recognition</w:t>
+            </w:r>
+          </w:p>
+        </w:tc>
+        <w:tc>
+          <w:tcPr>
+            <w:tcW w:type="dxa" w:w="2880"/>
+          </w:tcPr>
+          <w:p>
+            <w:r/>
+            <w:r>
+              <w:t xml:space="preserve">dashboard.pyannote.ai -&gt; sign up -&gt; </w:t>
+            </w:r>
+            <w:r>
+              <w:rPr>
+                <w:b/>
+              </w:rPr>
+              <w:t>API Keys</w:t>
+            </w:r>
+            <w:r>
+              <w:t xml:space="preserve"> -&gt; </w:t>
+            </w:r>
+            <w:r>
+              <w:rPr>
+                <w:b/>
+              </w:rPr>
+              <w:t>Create new key</w:t>
+            </w:r>
+            <w:r>
+              <w:t>. Copy it immediately (it is shown once). Check the dashboard for current free credits and pricing.</w:t>
+            </w:r>
+          </w:p>
+        </w:tc>
+      </w:tr>
+      <w:tr>
+        <w:tc>
+          <w:tcPr>
+            <w:tcW w:type="dxa" w:w="2880"/>
+          </w:tcPr>
+          <w:p>
+            <w:r/>
+            <w:r>
+              <w:rPr>
+                <w:b/>
+              </w:rPr>
+              <w:t>Hugging Face token</w:t>
+            </w:r>
+            <w:r>
+              <w:t xml:space="preserve"> (local pyannote only)</w:t>
+            </w:r>
+          </w:p>
+        </w:tc>
+        <w:tc>
+          <w:tcPr>
+            <w:tcW w:type="dxa" w:w="2880"/>
+          </w:tcPr>
+          <w:p>
+            <w:r/>
+            <w:r>
+              <w:t>Running pyannote.audio on your own PC</w:t>
+            </w:r>
+          </w:p>
+        </w:tc>
+        <w:tc>
+          <w:tcPr>
+            <w:tcW w:type="dxa" w:w="2880"/>
+          </w:tcPr>
+          <w:p>
+            <w:r/>
+            <w:r>
+              <w:t>huggingface.co/settings/tokens, and accept the pyannote model terms.</w:t>
+            </w:r>
+          </w:p>
+        </w:tc>
+      </w:tr>
+      <w:tr>
+        <w:tc>
+          <w:tcPr>
+            <w:tcW w:type="dxa" w:w="2880"/>
+          </w:tcPr>
+          <w:p>
+            <w:r/>
+            <w:r>
+              <w:rPr>
+                <w:b/>
+              </w:rPr>
               <w:t>AssemblyAI</w:t>
             </w:r>
             <w:r>
@@ -6454,6 +7486,20 @@
           <w:sz w:val="17"/>
         </w:rPr>
         <w:t>GEMINI_API_KEY = "AIza..."</w:t>
+      </w:r>
+    </w:p>
+    <w:p>
+      <w:pPr>
+        <w:spacing w:after="0"/>
+        <w:ind w:left="200"/>
+      </w:pPr>
+      <w:r>
+        <w:rPr>
+          <w:rFonts w:ascii="Consolas" w:hAnsi="Consolas"/>
+          <w:color w:val="2C3A8C"/>
+          <w:sz w:val="17"/>
+        </w:rPr>
+        <w:t>PYANNOTEAI_API_KEY = "..."   # speaker names (pyannote)</w:t>
       </w:r>
     </w:p>
     <w:p>
@@ -6926,7 +7972,7 @@
         <w:rPr>
           <w:b/>
         </w:rPr>
-        <w:t>60 automated tests</w:t>
+        <w:t>79 automated tests</w:t>
       </w:r>
       <w:r>
         <w:t xml:space="preserve"> (run with </w:t>
@@ -6938,7 +7984,7 @@
         <w:t>python -m pytest tests</w:t>
       </w:r>
       <w:r>
-        <w:t>):</w:t>
+        <w:t>), including a fake pyannoteAI server (upload, diarize, identify, voiceprint), word-to-speaker alignment, voice-sample cutting and name suggestions:</w:t>
       </w:r>
     </w:p>
     <w:p>
@@ -7052,10 +8098,19 @@
         <w:rPr>
           <w:b/>
         </w:rPr>
-        <w:t>Speaker identification</w:t>
-      </w:r>
-      <w:r>
-        <w:t xml:space="preserve"> for audio needs AssemblyAI. Without it, audio is transcribed as a single "Speaker". Text transcripts with names are fully supported, and you can rename speakers on the Transcript tab.</w:t>
+        <w:t>Speaker separation and names</w:t>
+      </w:r>
+      <w:r>
+        <w:t xml:space="preserve"> for audio need a speaker engine (pyannoteAI key, local pyannote, or AssemblyAI). Without one, audio is a single "Speaker". Voice-based names need saved voice profiles; otherwise use the </w:t>
+      </w:r>
+      <w:r>
+        <w:rPr>
+          <w:b/>
+        </w:rPr>
+        <w:t>Who is who?</w:t>
+      </w:r>
+      <w:r>
+        <w:t xml:space="preserve"> panel. Overlapping speech and very short interjections can be mislabelled. Text transcripts with names are fully supported.</w:t>
       </w:r>
     </w:p>
     <w:p>
@@ -7069,7 +8124,16 @@
         <w:t>Live AI services</w:t>
       </w:r>
       <w:r>
-        <w:t xml:space="preserve"> (Groq, Gemini, OpenRouter, AssemblyAI) and </w:t>
+        <w:t xml:space="preserve"> (Groq, Gemini, OpenRouter, AssemblyAI, </w:t>
+      </w:r>
+      <w:r>
+        <w:rPr>
+          <w:b/>
+        </w:rPr>
+        <w:t>pyannoteAI</w:t>
+      </w:r>
+      <w:r>
+        <w:t xml:space="preserve">) and </w:t>
       </w:r>
       <w:r>
         <w:rPr>
@@ -7360,6 +8424,105 @@
           <w:p>
             <w:r/>
             <w:r>
+              <w:t>Everything says "Speaker" / "Speaker 1"</w:t>
+            </w:r>
+          </w:p>
+        </w:tc>
+        <w:tc>
+          <w:tcPr>
+            <w:tcW w:type="dxa" w:w="4320"/>
+          </w:tcPr>
+          <w:p>
+            <w:r/>
+            <w:r>
+              <w:t xml:space="preserve">Add a </w:t>
+            </w:r>
+            <w:r>
+              <w:rPr>
+                <w:rFonts w:ascii="Consolas" w:hAnsi="Consolas"/>
+              </w:rPr>
+              <w:t>PYANNOTEAI_API_KEY</w:t>
+            </w:r>
+            <w:r>
+              <w:t xml:space="preserve"> (Settings -&gt; AI &amp; speech) and re-upload; or name voices in Transcript -&gt; </w:t>
+            </w:r>
+            <w:r>
+              <w:rPr>
+                <w:b/>
+              </w:rPr>
+              <w:t>Who is who?</w:t>
+            </w:r>
+            <w:r>
+              <w:t>.</w:t>
+            </w:r>
+          </w:p>
+        </w:tc>
+      </w:tr>
+      <w:tr>
+        <w:tc>
+          <w:tcPr>
+            <w:tcW w:type="dxa" w:w="4320"/>
+          </w:tcPr>
+          <w:p>
+            <w:r/>
+            <w:r>
+              <w:t>"pyannoteAI says a subscription or credits are required (402)"</w:t>
+            </w:r>
+          </w:p>
+        </w:tc>
+        <w:tc>
+          <w:tcPr>
+            <w:tcW w:type="dxa" w:w="4320"/>
+          </w:tcPr>
+          <w:p>
+            <w:r/>
+            <w:r>
+              <w:t>Your pyannoteAI account has no credits left. Check dashboard.pyannote.ai. The transcript is still saved with one speaker.</w:t>
+            </w:r>
+          </w:p>
+        </w:tc>
+      </w:tr>
+      <w:tr>
+        <w:tc>
+          <w:tcPr>
+            <w:tcW w:type="dxa" w:w="4320"/>
+          </w:tcPr>
+          <w:p>
+            <w:r/>
+            <w:r>
+              <w:t>A person is labelled with the wrong name</w:t>
+            </w:r>
+          </w:p>
+        </w:tc>
+        <w:tc>
+          <w:tcPr>
+            <w:tcW w:type="dxa" w:w="4320"/>
+          </w:tcPr>
+          <w:p>
+            <w:r/>
+            <w:r>
+              <w:t xml:space="preserve">Raise </w:t>
+            </w:r>
+            <w:r>
+              <w:rPr>
+                <w:b/>
+              </w:rPr>
+              <w:t>Match strictness</w:t>
+            </w:r>
+            <w:r>
+              <w:t xml:space="preserve"> in Settings -&gt; Voices, or re-create that person's voice profile from a longer, cleaner clip.</w:t>
+            </w:r>
+          </w:p>
+        </w:tc>
+      </w:tr>
+      <w:tr>
+        <w:tc>
+          <w:tcPr>
+            <w:tcW w:type="dxa" w:w="4320"/>
+          </w:tcPr>
+          <w:p>
+            <w:r/>
+            <w:r>
               <w:t>Search finds nothing</w:t>
             </w:r>
           </w:p>
@@ -7754,6 +8917,15 @@
       </w:r>
       <w:r>
         <w:t xml:space="preserve"> - a database that finds items by similarity of meaning. </w:t>
+      </w:r>
+      <w:r>
+        <w:rPr>
+          <w:b/>
+        </w:rPr>
+        <w:t>Voiceprint</w:t>
+      </w:r>
+      <w:r>
+        <w:t xml:space="preserve"> - a compact numeric fingerprint of a person's voice, used to recognise them in later recordings. </w:t>
       </w:r>
       <w:r>
         <w:rPr>

</xml_diff>

<commit_message>
Add project report and code walkthrough with screenshots and diagrams
- docs/MeetingAI_Project_Report: architecture, flows, screenshots, deployment.
- docs/MeetingAI_Code_Walkthrough: every file explained.
- 25 app screenshots and 11 architecture diagrams (docs/images) with the tools
  that regenerate them (docs/tools) and a build script for Word/PDF output.
- Document renderer supports images, links and page breaks.
- Dashboard donut legend moved below the chart.

Co-Authored-By: Claude Sonnet 5.5 <noreply@anthropic.com>
</commit_message>
<xml_diff>
--- a/docs/MeetingAI_Project_Guide.docx
+++ b/docs/MeetingAI_Project_Guide.docx
@@ -624,13 +624,13 @@
         <w:tblLook w:firstColumn="1" w:firstRow="1" w:lastColumn="0" w:lastRow="0" w:noHBand="0" w:noVBand="1" w:val="04A0"/>
       </w:tblPr>
       <w:tblGrid>
-        <w:gridCol w:w="4320"/>
-        <w:gridCol w:w="4320"/>
+        <w:gridCol w:w="4824"/>
+        <w:gridCol w:w="4824"/>
       </w:tblGrid>
       <w:tr>
         <w:tc>
           <w:tcPr>
-            <w:tcW w:type="dxa" w:w="4320"/>
+            <w:tcW w:type="dxa" w:w="4824"/>
           </w:tcPr>
           <w:p>
             <w:r/>
@@ -644,7 +644,7 @@
         </w:tc>
         <w:tc>
           <w:tcPr>
-            <w:tcW w:type="dxa" w:w="4320"/>
+            <w:tcW w:type="dxa" w:w="4824"/>
           </w:tcPr>
           <w:p>
             <w:r/>
@@ -660,7 +660,7 @@
       <w:tr>
         <w:tc>
           <w:tcPr>
-            <w:tcW w:type="dxa" w:w="4320"/>
+            <w:tcW w:type="dxa" w:w="4824"/>
           </w:tcPr>
           <w:p>
             <w:r/>
@@ -674,7 +674,7 @@
         </w:tc>
         <w:tc>
           <w:tcPr>
-            <w:tcW w:type="dxa" w:w="4320"/>
+            <w:tcW w:type="dxa" w:w="4824"/>
           </w:tcPr>
           <w:p>
             <w:r/>
@@ -687,7 +687,7 @@
       <w:tr>
         <w:tc>
           <w:tcPr>
-            <w:tcW w:type="dxa" w:w="4320"/>
+            <w:tcW w:type="dxa" w:w="4824"/>
           </w:tcPr>
           <w:p>
             <w:r/>
@@ -701,7 +701,7 @@
         </w:tc>
         <w:tc>
           <w:tcPr>
-            <w:tcW w:type="dxa" w:w="4320"/>
+            <w:tcW w:type="dxa" w:w="4824"/>
           </w:tcPr>
           <w:p>
             <w:r/>
@@ -714,7 +714,7 @@
       <w:tr>
         <w:tc>
           <w:tcPr>
-            <w:tcW w:type="dxa" w:w="4320"/>
+            <w:tcW w:type="dxa" w:w="4824"/>
           </w:tcPr>
           <w:p>
             <w:r/>
@@ -728,7 +728,7 @@
         </w:tc>
         <w:tc>
           <w:tcPr>
-            <w:tcW w:type="dxa" w:w="4320"/>
+            <w:tcW w:type="dxa" w:w="4824"/>
           </w:tcPr>
           <w:p>
             <w:r/>
@@ -741,7 +741,7 @@
       <w:tr>
         <w:tc>
           <w:tcPr>
-            <w:tcW w:type="dxa" w:w="4320"/>
+            <w:tcW w:type="dxa" w:w="4824"/>
           </w:tcPr>
           <w:p>
             <w:r/>
@@ -755,7 +755,7 @@
         </w:tc>
         <w:tc>
           <w:tcPr>
-            <w:tcW w:type="dxa" w:w="4320"/>
+            <w:tcW w:type="dxa" w:w="4824"/>
           </w:tcPr>
           <w:p>
             <w:r/>
@@ -822,7 +822,7 @@
       <w:tr>
         <w:tc>
           <w:tcPr>
-            <w:tcW w:type="dxa" w:w="4320"/>
+            <w:tcW w:type="dxa" w:w="4824"/>
           </w:tcPr>
           <w:p>
             <w:r/>
@@ -836,7 +836,7 @@
         </w:tc>
         <w:tc>
           <w:tcPr>
-            <w:tcW w:type="dxa" w:w="4320"/>
+            <w:tcW w:type="dxa" w:w="4824"/>
           </w:tcPr>
           <w:p>
             <w:r/>
@@ -849,7 +849,7 @@
       <w:tr>
         <w:tc>
           <w:tcPr>
-            <w:tcW w:type="dxa" w:w="4320"/>
+            <w:tcW w:type="dxa" w:w="4824"/>
           </w:tcPr>
           <w:p>
             <w:r/>
@@ -863,7 +863,7 @@
         </w:tc>
         <w:tc>
           <w:tcPr>
-            <w:tcW w:type="dxa" w:w="4320"/>
+            <w:tcW w:type="dxa" w:w="4824"/>
           </w:tcPr>
           <w:p>
             <w:r/>
@@ -876,7 +876,7 @@
       <w:tr>
         <w:tc>
           <w:tcPr>
-            <w:tcW w:type="dxa" w:w="4320"/>
+            <w:tcW w:type="dxa" w:w="4824"/>
           </w:tcPr>
           <w:p>
             <w:r/>
@@ -890,7 +890,7 @@
         </w:tc>
         <w:tc>
           <w:tcPr>
-            <w:tcW w:type="dxa" w:w="4320"/>
+            <w:tcW w:type="dxa" w:w="4824"/>
           </w:tcPr>
           <w:p>
             <w:r/>
@@ -903,7 +903,7 @@
       <w:tr>
         <w:tc>
           <w:tcPr>
-            <w:tcW w:type="dxa" w:w="4320"/>
+            <w:tcW w:type="dxa" w:w="4824"/>
           </w:tcPr>
           <w:p>
             <w:r/>
@@ -917,7 +917,7 @@
         </w:tc>
         <w:tc>
           <w:tcPr>
-            <w:tcW w:type="dxa" w:w="4320"/>
+            <w:tcW w:type="dxa" w:w="4824"/>
           </w:tcPr>
           <w:p>
             <w:r/>
@@ -939,7 +939,7 @@
       <w:tr>
         <w:tc>
           <w:tcPr>
-            <w:tcW w:type="dxa" w:w="4320"/>
+            <w:tcW w:type="dxa" w:w="4824"/>
           </w:tcPr>
           <w:p>
             <w:r/>
@@ -953,7 +953,7 @@
         </w:tc>
         <w:tc>
           <w:tcPr>
-            <w:tcW w:type="dxa" w:w="4320"/>
+            <w:tcW w:type="dxa" w:w="4824"/>
           </w:tcPr>
           <w:p>
             <w:r/>
@@ -966,7 +966,7 @@
       <w:tr>
         <w:tc>
           <w:tcPr>
-            <w:tcW w:type="dxa" w:w="4320"/>
+            <w:tcW w:type="dxa" w:w="4824"/>
           </w:tcPr>
           <w:p>
             <w:r/>
@@ -980,7 +980,7 @@
         </w:tc>
         <w:tc>
           <w:tcPr>
-            <w:tcW w:type="dxa" w:w="4320"/>
+            <w:tcW w:type="dxa" w:w="4824"/>
           </w:tcPr>
           <w:p>
             <w:r/>
@@ -993,7 +993,7 @@
       <w:tr>
         <w:tc>
           <w:tcPr>
-            <w:tcW w:type="dxa" w:w="4320"/>
+            <w:tcW w:type="dxa" w:w="4824"/>
           </w:tcPr>
           <w:p>
             <w:r/>
@@ -1007,7 +1007,7 @@
         </w:tc>
         <w:tc>
           <w:tcPr>
-            <w:tcW w:type="dxa" w:w="4320"/>
+            <w:tcW w:type="dxa" w:w="4824"/>
           </w:tcPr>
           <w:p>
             <w:r/>
@@ -1020,7 +1020,7 @@
       <w:tr>
         <w:tc>
           <w:tcPr>
-            <w:tcW w:type="dxa" w:w="4320"/>
+            <w:tcW w:type="dxa" w:w="4824"/>
           </w:tcPr>
           <w:p>
             <w:r/>
@@ -1034,7 +1034,7 @@
         </w:tc>
         <w:tc>
           <w:tcPr>
-            <w:tcW w:type="dxa" w:w="4320"/>
+            <w:tcW w:type="dxa" w:w="4824"/>
           </w:tcPr>
           <w:p>
             <w:r/>
@@ -2373,14 +2373,14 @@
         <w:tblLook w:firstColumn="1" w:firstRow="1" w:lastColumn="0" w:lastRow="0" w:noHBand="0" w:noVBand="1" w:val="04A0"/>
       </w:tblPr>
       <w:tblGrid>
-        <w:gridCol w:w="2880"/>
-        <w:gridCol w:w="2880"/>
-        <w:gridCol w:w="2880"/>
+        <w:gridCol w:w="3216"/>
+        <w:gridCol w:w="3216"/>
+        <w:gridCol w:w="3216"/>
       </w:tblGrid>
       <w:tr>
         <w:tc>
           <w:tcPr>
-            <w:tcW w:type="dxa" w:w="2880"/>
+            <w:tcW w:type="dxa" w:w="3216"/>
           </w:tcPr>
           <w:p>
             <w:r/>
@@ -2394,7 +2394,7 @@
         </w:tc>
         <w:tc>
           <w:tcPr>
-            <w:tcW w:type="dxa" w:w="2880"/>
+            <w:tcW w:type="dxa" w:w="3216"/>
           </w:tcPr>
           <w:p>
             <w:r/>
@@ -2408,7 +2408,7 @@
         </w:tc>
         <w:tc>
           <w:tcPr>
-            <w:tcW w:type="dxa" w:w="2880"/>
+            <w:tcW w:type="dxa" w:w="3216"/>
           </w:tcPr>
           <w:p>
             <w:r/>
@@ -2424,7 +2424,7 @@
       <w:tr>
         <w:tc>
           <w:tcPr>
-            <w:tcW w:type="dxa" w:w="2880"/>
+            <w:tcW w:type="dxa" w:w="3216"/>
           </w:tcPr>
           <w:p>
             <w:r/>
@@ -2435,7 +2435,7 @@
         </w:tc>
         <w:tc>
           <w:tcPr>
-            <w:tcW w:type="dxa" w:w="2880"/>
+            <w:tcW w:type="dxa" w:w="3216"/>
           </w:tcPr>
           <w:p>
             <w:r/>
@@ -2449,7 +2449,7 @@
         </w:tc>
         <w:tc>
           <w:tcPr>
-            <w:tcW w:type="dxa" w:w="2880"/>
+            <w:tcW w:type="dxa" w:w="3216"/>
           </w:tcPr>
           <w:p>
             <w:r/>
@@ -2462,7 +2462,7 @@
       <w:tr>
         <w:tc>
           <w:tcPr>
-            <w:tcW w:type="dxa" w:w="2880"/>
+            <w:tcW w:type="dxa" w:w="3216"/>
           </w:tcPr>
           <w:p>
             <w:r/>
@@ -2473,7 +2473,7 @@
         </w:tc>
         <w:tc>
           <w:tcPr>
-            <w:tcW w:type="dxa" w:w="2880"/>
+            <w:tcW w:type="dxa" w:w="3216"/>
           </w:tcPr>
           <w:p>
             <w:r/>
@@ -2493,7 +2493,7 @@
         </w:tc>
         <w:tc>
           <w:tcPr>
-            <w:tcW w:type="dxa" w:w="2880"/>
+            <w:tcW w:type="dxa" w:w="3216"/>
           </w:tcPr>
           <w:p>
             <w:r/>
@@ -2506,7 +2506,7 @@
       <w:tr>
         <w:tc>
           <w:tcPr>
-            <w:tcW w:type="dxa" w:w="2880"/>
+            <w:tcW w:type="dxa" w:w="3216"/>
           </w:tcPr>
           <w:p>
             <w:r/>
@@ -2517,7 +2517,7 @@
         </w:tc>
         <w:tc>
           <w:tcPr>
-            <w:tcW w:type="dxa" w:w="2880"/>
+            <w:tcW w:type="dxa" w:w="3216"/>
           </w:tcPr>
           <w:p>
             <w:r/>
@@ -2531,7 +2531,7 @@
         </w:tc>
         <w:tc>
           <w:tcPr>
-            <w:tcW w:type="dxa" w:w="2880"/>
+            <w:tcW w:type="dxa" w:w="3216"/>
           </w:tcPr>
           <w:p>
             <w:r/>
@@ -2544,7 +2544,7 @@
       <w:tr>
         <w:tc>
           <w:tcPr>
-            <w:tcW w:type="dxa" w:w="2880"/>
+            <w:tcW w:type="dxa" w:w="3216"/>
           </w:tcPr>
           <w:p>
             <w:r/>
@@ -2555,7 +2555,7 @@
         </w:tc>
         <w:tc>
           <w:tcPr>
-            <w:tcW w:type="dxa" w:w="2880"/>
+            <w:tcW w:type="dxa" w:w="3216"/>
           </w:tcPr>
           <w:p>
             <w:r/>
@@ -2569,7 +2569,7 @@
         </w:tc>
         <w:tc>
           <w:tcPr>
-            <w:tcW w:type="dxa" w:w="2880"/>
+            <w:tcW w:type="dxa" w:w="3216"/>
           </w:tcPr>
           <w:p>
             <w:r/>
@@ -2582,7 +2582,7 @@
       <w:tr>
         <w:tc>
           <w:tcPr>
-            <w:tcW w:type="dxa" w:w="2880"/>
+            <w:tcW w:type="dxa" w:w="3216"/>
           </w:tcPr>
           <w:p>
             <w:r/>
@@ -2593,7 +2593,7 @@
         </w:tc>
         <w:tc>
           <w:tcPr>
-            <w:tcW w:type="dxa" w:w="2880"/>
+            <w:tcW w:type="dxa" w:w="3216"/>
           </w:tcPr>
           <w:p>
             <w:r/>
@@ -2607,7 +2607,7 @@
         </w:tc>
         <w:tc>
           <w:tcPr>
-            <w:tcW w:type="dxa" w:w="2880"/>
+            <w:tcW w:type="dxa" w:w="3216"/>
           </w:tcPr>
           <w:p>
             <w:r/>
@@ -2620,7 +2620,7 @@
       <w:tr>
         <w:tc>
           <w:tcPr>
-            <w:tcW w:type="dxa" w:w="2880"/>
+            <w:tcW w:type="dxa" w:w="3216"/>
           </w:tcPr>
           <w:p>
             <w:r/>
@@ -2631,7 +2631,7 @@
         </w:tc>
         <w:tc>
           <w:tcPr>
-            <w:tcW w:type="dxa" w:w="2880"/>
+            <w:tcW w:type="dxa" w:w="3216"/>
           </w:tcPr>
           <w:p>
             <w:r/>
@@ -2654,7 +2654,7 @@
         </w:tc>
         <w:tc>
           <w:tcPr>
-            <w:tcW w:type="dxa" w:w="2880"/>
+            <w:tcW w:type="dxa" w:w="3216"/>
           </w:tcPr>
           <w:p>
             <w:r/>
@@ -2667,7 +2667,7 @@
       <w:tr>
         <w:tc>
           <w:tcPr>
-            <w:tcW w:type="dxa" w:w="2880"/>
+            <w:tcW w:type="dxa" w:w="3216"/>
           </w:tcPr>
           <w:p>
             <w:r/>
@@ -2678,7 +2678,7 @@
         </w:tc>
         <w:tc>
           <w:tcPr>
-            <w:tcW w:type="dxa" w:w="2880"/>
+            <w:tcW w:type="dxa" w:w="3216"/>
           </w:tcPr>
           <w:p>
             <w:r/>
@@ -2710,7 +2710,7 @@
         </w:tc>
         <w:tc>
           <w:tcPr>
-            <w:tcW w:type="dxa" w:w="2880"/>
+            <w:tcW w:type="dxa" w:w="3216"/>
           </w:tcPr>
           <w:p>
             <w:r/>
@@ -2723,7 +2723,7 @@
       <w:tr>
         <w:tc>
           <w:tcPr>
-            <w:tcW w:type="dxa" w:w="2880"/>
+            <w:tcW w:type="dxa" w:w="3216"/>
           </w:tcPr>
           <w:p>
             <w:r/>
@@ -2734,7 +2734,7 @@
         </w:tc>
         <w:tc>
           <w:tcPr>
-            <w:tcW w:type="dxa" w:w="2880"/>
+            <w:tcW w:type="dxa" w:w="3216"/>
           </w:tcPr>
           <w:p>
             <w:r/>
@@ -2751,7 +2751,7 @@
         </w:tc>
         <w:tc>
           <w:tcPr>
-            <w:tcW w:type="dxa" w:w="2880"/>
+            <w:tcW w:type="dxa" w:w="3216"/>
           </w:tcPr>
           <w:p>
             <w:r/>
@@ -2764,7 +2764,7 @@
       <w:tr>
         <w:tc>
           <w:tcPr>
-            <w:tcW w:type="dxa" w:w="2880"/>
+            <w:tcW w:type="dxa" w:w="3216"/>
           </w:tcPr>
           <w:p>
             <w:r/>
@@ -2775,7 +2775,7 @@
         </w:tc>
         <w:tc>
           <w:tcPr>
-            <w:tcW w:type="dxa" w:w="2880"/>
+            <w:tcW w:type="dxa" w:w="3216"/>
           </w:tcPr>
           <w:p>
             <w:r/>
@@ -2789,7 +2789,7 @@
         </w:tc>
         <w:tc>
           <w:tcPr>
-            <w:tcW w:type="dxa" w:w="2880"/>
+            <w:tcW w:type="dxa" w:w="3216"/>
           </w:tcPr>
           <w:p>
             <w:r/>
@@ -2802,7 +2802,7 @@
       <w:tr>
         <w:tc>
           <w:tcPr>
-            <w:tcW w:type="dxa" w:w="2880"/>
+            <w:tcW w:type="dxa" w:w="3216"/>
           </w:tcPr>
           <w:p>
             <w:r/>
@@ -2813,7 +2813,7 @@
         </w:tc>
         <w:tc>
           <w:tcPr>
-            <w:tcW w:type="dxa" w:w="2880"/>
+            <w:tcW w:type="dxa" w:w="3216"/>
           </w:tcPr>
           <w:p>
             <w:r/>
@@ -2830,7 +2830,7 @@
         </w:tc>
         <w:tc>
           <w:tcPr>
-            <w:tcW w:type="dxa" w:w="2880"/>
+            <w:tcW w:type="dxa" w:w="3216"/>
           </w:tcPr>
           <w:p>
             <w:r/>
@@ -2843,7 +2843,7 @@
       <w:tr>
         <w:tc>
           <w:tcPr>
-            <w:tcW w:type="dxa" w:w="2880"/>
+            <w:tcW w:type="dxa" w:w="3216"/>
           </w:tcPr>
           <w:p>
             <w:r/>
@@ -2854,7 +2854,7 @@
         </w:tc>
         <w:tc>
           <w:tcPr>
-            <w:tcW w:type="dxa" w:w="2880"/>
+            <w:tcW w:type="dxa" w:w="3216"/>
           </w:tcPr>
           <w:p>
             <w:r/>
@@ -2898,7 +2898,7 @@
         </w:tc>
         <w:tc>
           <w:tcPr>
-            <w:tcW w:type="dxa" w:w="2880"/>
+            <w:tcW w:type="dxa" w:w="3216"/>
           </w:tcPr>
           <w:p>
             <w:r/>
@@ -2911,7 +2911,7 @@
       <w:tr>
         <w:tc>
           <w:tcPr>
-            <w:tcW w:type="dxa" w:w="2880"/>
+            <w:tcW w:type="dxa" w:w="3216"/>
           </w:tcPr>
           <w:p>
             <w:r/>
@@ -2922,7 +2922,7 @@
         </w:tc>
         <w:tc>
           <w:tcPr>
-            <w:tcW w:type="dxa" w:w="2880"/>
+            <w:tcW w:type="dxa" w:w="3216"/>
           </w:tcPr>
           <w:p>
             <w:r/>
@@ -2954,7 +2954,7 @@
         </w:tc>
         <w:tc>
           <w:tcPr>
-            <w:tcW w:type="dxa" w:w="2880"/>
+            <w:tcW w:type="dxa" w:w="3216"/>
           </w:tcPr>
           <w:p>
             <w:r/>
@@ -2967,7 +2967,7 @@
       <w:tr>
         <w:tc>
           <w:tcPr>
-            <w:tcW w:type="dxa" w:w="2880"/>
+            <w:tcW w:type="dxa" w:w="3216"/>
           </w:tcPr>
           <w:p>
             <w:r/>
@@ -2978,7 +2978,7 @@
         </w:tc>
         <w:tc>
           <w:tcPr>
-            <w:tcW w:type="dxa" w:w="2880"/>
+            <w:tcW w:type="dxa" w:w="3216"/>
           </w:tcPr>
           <w:p>
             <w:r/>
@@ -3001,7 +3001,7 @@
         </w:tc>
         <w:tc>
           <w:tcPr>
-            <w:tcW w:type="dxa" w:w="2880"/>
+            <w:tcW w:type="dxa" w:w="3216"/>
           </w:tcPr>
           <w:p>
             <w:r/>
@@ -3014,7 +3014,7 @@
       <w:tr>
         <w:tc>
           <w:tcPr>
-            <w:tcW w:type="dxa" w:w="2880"/>
+            <w:tcW w:type="dxa" w:w="3216"/>
           </w:tcPr>
           <w:p>
             <w:r/>
@@ -3025,7 +3025,7 @@
         </w:tc>
         <w:tc>
           <w:tcPr>
-            <w:tcW w:type="dxa" w:w="2880"/>
+            <w:tcW w:type="dxa" w:w="3216"/>
           </w:tcPr>
           <w:p>
             <w:r/>
@@ -3042,7 +3042,7 @@
         </w:tc>
         <w:tc>
           <w:tcPr>
-            <w:tcW w:type="dxa" w:w="2880"/>
+            <w:tcW w:type="dxa" w:w="3216"/>
           </w:tcPr>
           <w:p>
             <w:r/>
@@ -3055,7 +3055,7 @@
       <w:tr>
         <w:tc>
           <w:tcPr>
-            <w:tcW w:type="dxa" w:w="2880"/>
+            <w:tcW w:type="dxa" w:w="3216"/>
           </w:tcPr>
           <w:p>
             <w:r/>
@@ -3066,7 +3066,7 @@
         </w:tc>
         <w:tc>
           <w:tcPr>
-            <w:tcW w:type="dxa" w:w="2880"/>
+            <w:tcW w:type="dxa" w:w="3216"/>
           </w:tcPr>
           <w:p>
             <w:r/>
@@ -3086,7 +3086,7 @@
         </w:tc>
         <w:tc>
           <w:tcPr>
-            <w:tcW w:type="dxa" w:w="2880"/>
+            <w:tcW w:type="dxa" w:w="3216"/>
           </w:tcPr>
           <w:p>
             <w:r/>
@@ -3264,14 +3264,14 @@
         <w:tblLook w:firstColumn="1" w:firstRow="1" w:lastColumn="0" w:lastRow="0" w:noHBand="0" w:noVBand="1" w:val="04A0"/>
       </w:tblPr>
       <w:tblGrid>
-        <w:gridCol w:w="2880"/>
-        <w:gridCol w:w="2880"/>
-        <w:gridCol w:w="2880"/>
+        <w:gridCol w:w="3216"/>
+        <w:gridCol w:w="3216"/>
+        <w:gridCol w:w="3216"/>
       </w:tblGrid>
       <w:tr>
         <w:tc>
           <w:tcPr>
-            <w:tcW w:type="dxa" w:w="2880"/>
+            <w:tcW w:type="dxa" w:w="3216"/>
           </w:tcPr>
           <w:p>
             <w:r/>
@@ -3285,7 +3285,7 @@
         </w:tc>
         <w:tc>
           <w:tcPr>
-            <w:tcW w:type="dxa" w:w="2880"/>
+            <w:tcW w:type="dxa" w:w="3216"/>
           </w:tcPr>
           <w:p>
             <w:r/>
@@ -3299,7 +3299,7 @@
         </w:tc>
         <w:tc>
           <w:tcPr>
-            <w:tcW w:type="dxa" w:w="2880"/>
+            <w:tcW w:type="dxa" w:w="3216"/>
           </w:tcPr>
           <w:p>
             <w:r/>
@@ -3315,7 +3315,7 @@
       <w:tr>
         <w:tc>
           <w:tcPr>
-            <w:tcW w:type="dxa" w:w="2880"/>
+            <w:tcW w:type="dxa" w:w="3216"/>
           </w:tcPr>
           <w:p>
             <w:r/>
@@ -3341,7 +3341,7 @@
         </w:tc>
         <w:tc>
           <w:tcPr>
-            <w:tcW w:type="dxa" w:w="2880"/>
+            <w:tcW w:type="dxa" w:w="3216"/>
           </w:tcPr>
           <w:p>
             <w:r/>
@@ -3352,7 +3352,7 @@
         </w:tc>
         <w:tc>
           <w:tcPr>
-            <w:tcW w:type="dxa" w:w="2880"/>
+            <w:tcW w:type="dxa" w:w="3216"/>
           </w:tcPr>
           <w:p>
             <w:r/>
@@ -3365,7 +3365,7 @@
       <w:tr>
         <w:tc>
           <w:tcPr>
-            <w:tcW w:type="dxa" w:w="2880"/>
+            <w:tcW w:type="dxa" w:w="3216"/>
           </w:tcPr>
           <w:p>
             <w:r/>
@@ -3400,7 +3400,7 @@
         </w:tc>
         <w:tc>
           <w:tcPr>
-            <w:tcW w:type="dxa" w:w="2880"/>
+            <w:tcW w:type="dxa" w:w="3216"/>
           </w:tcPr>
           <w:p>
             <w:r/>
@@ -3411,7 +3411,7 @@
         </w:tc>
         <w:tc>
           <w:tcPr>
-            <w:tcW w:type="dxa" w:w="2880"/>
+            <w:tcW w:type="dxa" w:w="3216"/>
           </w:tcPr>
           <w:p>
             <w:r/>
@@ -3492,13 +3492,13 @@
         <w:tblLook w:firstColumn="1" w:firstRow="1" w:lastColumn="0" w:lastRow="0" w:noHBand="0" w:noVBand="1" w:val="04A0"/>
       </w:tblPr>
       <w:tblGrid>
-        <w:gridCol w:w="4320"/>
-        <w:gridCol w:w="4320"/>
+        <w:gridCol w:w="4824"/>
+        <w:gridCol w:w="4824"/>
       </w:tblGrid>
       <w:tr>
         <w:tc>
           <w:tcPr>
-            <w:tcW w:type="dxa" w:w="4320"/>
+            <w:tcW w:type="dxa" w:w="4824"/>
           </w:tcPr>
           <w:p>
             <w:r/>
@@ -3512,7 +3512,7 @@
         </w:tc>
         <w:tc>
           <w:tcPr>
-            <w:tcW w:type="dxa" w:w="4320"/>
+            <w:tcW w:type="dxa" w:w="4824"/>
           </w:tcPr>
           <w:p>
             <w:r/>
@@ -3528,7 +3528,7 @@
       <w:tr>
         <w:tc>
           <w:tcPr>
-            <w:tcW w:type="dxa" w:w="4320"/>
+            <w:tcW w:type="dxa" w:w="4824"/>
           </w:tcPr>
           <w:p>
             <w:r/>
@@ -3539,7 +3539,7 @@
         </w:tc>
         <w:tc>
           <w:tcPr>
-            <w:tcW w:type="dxa" w:w="4320"/>
+            <w:tcW w:type="dxa" w:w="4824"/>
           </w:tcPr>
           <w:p>
             <w:r/>
@@ -3552,7 +3552,7 @@
       <w:tr>
         <w:tc>
           <w:tcPr>
-            <w:tcW w:type="dxa" w:w="4320"/>
+            <w:tcW w:type="dxa" w:w="4824"/>
           </w:tcPr>
           <w:p>
             <w:r/>
@@ -3563,7 +3563,7 @@
         </w:tc>
         <w:tc>
           <w:tcPr>
-            <w:tcW w:type="dxa" w:w="4320"/>
+            <w:tcW w:type="dxa" w:w="4824"/>
           </w:tcPr>
           <w:p>
             <w:r/>
@@ -3576,7 +3576,7 @@
       <w:tr>
         <w:tc>
           <w:tcPr>
-            <w:tcW w:type="dxa" w:w="4320"/>
+            <w:tcW w:type="dxa" w:w="4824"/>
           </w:tcPr>
           <w:p>
             <w:r/>
@@ -3587,7 +3587,7 @@
         </w:tc>
         <w:tc>
           <w:tcPr>
-            <w:tcW w:type="dxa" w:w="4320"/>
+            <w:tcW w:type="dxa" w:w="4824"/>
           </w:tcPr>
           <w:p>
             <w:r/>
@@ -3600,7 +3600,7 @@
       <w:tr>
         <w:tc>
           <w:tcPr>
-            <w:tcW w:type="dxa" w:w="4320"/>
+            <w:tcW w:type="dxa" w:w="4824"/>
           </w:tcPr>
           <w:p>
             <w:r/>
@@ -3611,7 +3611,7 @@
         </w:tc>
         <w:tc>
           <w:tcPr>
-            <w:tcW w:type="dxa" w:w="4320"/>
+            <w:tcW w:type="dxa" w:w="4824"/>
           </w:tcPr>
           <w:p>
             <w:r/>
@@ -3624,7 +3624,7 @@
       <w:tr>
         <w:tc>
           <w:tcPr>
-            <w:tcW w:type="dxa" w:w="4320"/>
+            <w:tcW w:type="dxa" w:w="4824"/>
           </w:tcPr>
           <w:p>
             <w:r/>
@@ -3635,7 +3635,7 @@
         </w:tc>
         <w:tc>
           <w:tcPr>
-            <w:tcW w:type="dxa" w:w="4320"/>
+            <w:tcW w:type="dxa" w:w="4824"/>
           </w:tcPr>
           <w:p>
             <w:r/>
@@ -3648,7 +3648,7 @@
       <w:tr>
         <w:tc>
           <w:tcPr>
-            <w:tcW w:type="dxa" w:w="4320"/>
+            <w:tcW w:type="dxa" w:w="4824"/>
           </w:tcPr>
           <w:p>
             <w:r/>
@@ -3659,7 +3659,7 @@
         </w:tc>
         <w:tc>
           <w:tcPr>
-            <w:tcW w:type="dxa" w:w="4320"/>
+            <w:tcW w:type="dxa" w:w="4824"/>
           </w:tcPr>
           <w:p>
             <w:r/>
@@ -3672,7 +3672,7 @@
       <w:tr>
         <w:tc>
           <w:tcPr>
-            <w:tcW w:type="dxa" w:w="4320"/>
+            <w:tcW w:type="dxa" w:w="4824"/>
           </w:tcPr>
           <w:p>
             <w:r/>
@@ -3683,7 +3683,7 @@
         </w:tc>
         <w:tc>
           <w:tcPr>
-            <w:tcW w:type="dxa" w:w="4320"/>
+            <w:tcW w:type="dxa" w:w="4824"/>
           </w:tcPr>
           <w:p>
             <w:r/>
@@ -3696,7 +3696,7 @@
       <w:tr>
         <w:tc>
           <w:tcPr>
-            <w:tcW w:type="dxa" w:w="4320"/>
+            <w:tcW w:type="dxa" w:w="4824"/>
           </w:tcPr>
           <w:p>
             <w:r/>
@@ -3707,7 +3707,7 @@
         </w:tc>
         <w:tc>
           <w:tcPr>
-            <w:tcW w:type="dxa" w:w="4320"/>
+            <w:tcW w:type="dxa" w:w="4824"/>
           </w:tcPr>
           <w:p>
             <w:r/>
@@ -3720,7 +3720,7 @@
       <w:tr>
         <w:tc>
           <w:tcPr>
-            <w:tcW w:type="dxa" w:w="4320"/>
+            <w:tcW w:type="dxa" w:w="4824"/>
           </w:tcPr>
           <w:p>
             <w:r/>
@@ -3731,7 +3731,7 @@
         </w:tc>
         <w:tc>
           <w:tcPr>
-            <w:tcW w:type="dxa" w:w="4320"/>
+            <w:tcW w:type="dxa" w:w="4824"/>
           </w:tcPr>
           <w:p>
             <w:r/>
@@ -3744,7 +3744,7 @@
       <w:tr>
         <w:tc>
           <w:tcPr>
-            <w:tcW w:type="dxa" w:w="4320"/>
+            <w:tcW w:type="dxa" w:w="4824"/>
           </w:tcPr>
           <w:p>
             <w:r/>
@@ -3755,7 +3755,7 @@
         </w:tc>
         <w:tc>
           <w:tcPr>
-            <w:tcW w:type="dxa" w:w="4320"/>
+            <w:tcW w:type="dxa" w:w="4824"/>
           </w:tcPr>
           <w:p>
             <w:r/>
@@ -3768,7 +3768,7 @@
       <w:tr>
         <w:tc>
           <w:tcPr>
-            <w:tcW w:type="dxa" w:w="4320"/>
+            <w:tcW w:type="dxa" w:w="4824"/>
           </w:tcPr>
           <w:p>
             <w:r/>
@@ -3779,7 +3779,7 @@
         </w:tc>
         <w:tc>
           <w:tcPr>
-            <w:tcW w:type="dxa" w:w="4320"/>
+            <w:tcW w:type="dxa" w:w="4824"/>
           </w:tcPr>
           <w:p>
             <w:r/>
@@ -4363,14 +4363,14 @@
         <w:tblLook w:firstColumn="1" w:firstRow="1" w:lastColumn="0" w:lastRow="0" w:noHBand="0" w:noVBand="1" w:val="04A0"/>
       </w:tblPr>
       <w:tblGrid>
-        <w:gridCol w:w="2880"/>
-        <w:gridCol w:w="2880"/>
-        <w:gridCol w:w="2880"/>
+        <w:gridCol w:w="3216"/>
+        <w:gridCol w:w="3216"/>
+        <w:gridCol w:w="3216"/>
       </w:tblGrid>
       <w:tr>
         <w:tc>
           <w:tcPr>
-            <w:tcW w:type="dxa" w:w="2880"/>
+            <w:tcW w:type="dxa" w:w="3216"/>
           </w:tcPr>
           <w:p>
             <w:r/>
@@ -4384,7 +4384,7 @@
         </w:tc>
         <w:tc>
           <w:tcPr>
-            <w:tcW w:type="dxa" w:w="2880"/>
+            <w:tcW w:type="dxa" w:w="3216"/>
           </w:tcPr>
           <w:p>
             <w:r/>
@@ -4398,7 +4398,7 @@
         </w:tc>
         <w:tc>
           <w:tcPr>
-            <w:tcW w:type="dxa" w:w="2880"/>
+            <w:tcW w:type="dxa" w:w="3216"/>
           </w:tcPr>
           <w:p>
             <w:r/>
@@ -4414,7 +4414,7 @@
       <w:tr>
         <w:tc>
           <w:tcPr>
-            <w:tcW w:type="dxa" w:w="2880"/>
+            <w:tcW w:type="dxa" w:w="3216"/>
           </w:tcPr>
           <w:p>
             <w:r/>
@@ -4425,7 +4425,7 @@
         </w:tc>
         <w:tc>
           <w:tcPr>
-            <w:tcW w:type="dxa" w:w="2880"/>
+            <w:tcW w:type="dxa" w:w="3216"/>
           </w:tcPr>
           <w:p>
             <w:r/>
@@ -4436,7 +4436,7 @@
         </w:tc>
         <w:tc>
           <w:tcPr>
-            <w:tcW w:type="dxa" w:w="2880"/>
+            <w:tcW w:type="dxa" w:w="3216"/>
           </w:tcPr>
           <w:p>
             <w:r/>
@@ -4449,7 +4449,7 @@
       <w:tr>
         <w:tc>
           <w:tcPr>
-            <w:tcW w:type="dxa" w:w="2880"/>
+            <w:tcW w:type="dxa" w:w="3216"/>
           </w:tcPr>
           <w:p>
             <w:r/>
@@ -4460,7 +4460,7 @@
         </w:tc>
         <w:tc>
           <w:tcPr>
-            <w:tcW w:type="dxa" w:w="2880"/>
+            <w:tcW w:type="dxa" w:w="3216"/>
           </w:tcPr>
           <w:p>
             <w:r/>
@@ -4471,7 +4471,7 @@
         </w:tc>
         <w:tc>
           <w:tcPr>
-            <w:tcW w:type="dxa" w:w="2880"/>
+            <w:tcW w:type="dxa" w:w="3216"/>
           </w:tcPr>
           <w:p>
             <w:r/>
@@ -4484,7 +4484,7 @@
       <w:tr>
         <w:tc>
           <w:tcPr>
-            <w:tcW w:type="dxa" w:w="2880"/>
+            <w:tcW w:type="dxa" w:w="3216"/>
           </w:tcPr>
           <w:p>
             <w:r/>
@@ -4495,7 +4495,7 @@
         </w:tc>
         <w:tc>
           <w:tcPr>
-            <w:tcW w:type="dxa" w:w="2880"/>
+            <w:tcW w:type="dxa" w:w="3216"/>
           </w:tcPr>
           <w:p>
             <w:r/>
@@ -4506,7 +4506,7 @@
         </w:tc>
         <w:tc>
           <w:tcPr>
-            <w:tcW w:type="dxa" w:w="2880"/>
+            <w:tcW w:type="dxa" w:w="3216"/>
           </w:tcPr>
           <w:p>
             <w:r/>
@@ -4519,7 +4519,7 @@
       <w:tr>
         <w:tc>
           <w:tcPr>
-            <w:tcW w:type="dxa" w:w="2880"/>
+            <w:tcW w:type="dxa" w:w="3216"/>
           </w:tcPr>
           <w:p>
             <w:r/>
@@ -4530,7 +4530,7 @@
         </w:tc>
         <w:tc>
           <w:tcPr>
-            <w:tcW w:type="dxa" w:w="2880"/>
+            <w:tcW w:type="dxa" w:w="3216"/>
           </w:tcPr>
           <w:p>
             <w:r/>
@@ -4541,7 +4541,7 @@
         </w:tc>
         <w:tc>
           <w:tcPr>
-            <w:tcW w:type="dxa" w:w="2880"/>
+            <w:tcW w:type="dxa" w:w="3216"/>
           </w:tcPr>
           <w:p>
             <w:r/>
@@ -5051,13 +5051,13 @@
         <w:tblLook w:firstColumn="1" w:firstRow="1" w:lastColumn="0" w:lastRow="0" w:noHBand="0" w:noVBand="1" w:val="04A0"/>
       </w:tblPr>
       <w:tblGrid>
-        <w:gridCol w:w="4320"/>
-        <w:gridCol w:w="4320"/>
+        <w:gridCol w:w="4824"/>
+        <w:gridCol w:w="4824"/>
       </w:tblGrid>
       <w:tr>
         <w:tc>
           <w:tcPr>
-            <w:tcW w:type="dxa" w:w="4320"/>
+            <w:tcW w:type="dxa" w:w="4824"/>
           </w:tcPr>
           <w:p>
             <w:r/>
@@ -5071,7 +5071,7 @@
         </w:tc>
         <w:tc>
           <w:tcPr>
-            <w:tcW w:type="dxa" w:w="4320"/>
+            <w:tcW w:type="dxa" w:w="4824"/>
           </w:tcPr>
           <w:p>
             <w:r/>
@@ -5087,7 +5087,7 @@
       <w:tr>
         <w:tc>
           <w:tcPr>
-            <w:tcW w:type="dxa" w:w="4320"/>
+            <w:tcW w:type="dxa" w:w="4824"/>
           </w:tcPr>
           <w:p>
             <w:r/>
@@ -5098,7 +5098,7 @@
         </w:tc>
         <w:tc>
           <w:tcPr>
-            <w:tcW w:type="dxa" w:w="4320"/>
+            <w:tcW w:type="dxa" w:w="4824"/>
           </w:tcPr>
           <w:p>
             <w:r/>
@@ -5111,7 +5111,7 @@
       <w:tr>
         <w:tc>
           <w:tcPr>
-            <w:tcW w:type="dxa" w:w="4320"/>
+            <w:tcW w:type="dxa" w:w="4824"/>
           </w:tcPr>
           <w:p>
             <w:r/>
@@ -5122,7 +5122,7 @@
         </w:tc>
         <w:tc>
           <w:tcPr>
-            <w:tcW w:type="dxa" w:w="4320"/>
+            <w:tcW w:type="dxa" w:w="4824"/>
           </w:tcPr>
           <w:p>
             <w:r/>
@@ -5135,7 +5135,7 @@
       <w:tr>
         <w:tc>
           <w:tcPr>
-            <w:tcW w:type="dxa" w:w="4320"/>
+            <w:tcW w:type="dxa" w:w="4824"/>
           </w:tcPr>
           <w:p>
             <w:r/>
@@ -5146,7 +5146,7 @@
         </w:tc>
         <w:tc>
           <w:tcPr>
-            <w:tcW w:type="dxa" w:w="4320"/>
+            <w:tcW w:type="dxa" w:w="4824"/>
           </w:tcPr>
           <w:p>
             <w:r/>
@@ -5159,7 +5159,7 @@
       <w:tr>
         <w:tc>
           <w:tcPr>
-            <w:tcW w:type="dxa" w:w="4320"/>
+            <w:tcW w:type="dxa" w:w="4824"/>
           </w:tcPr>
           <w:p>
             <w:r/>
@@ -5170,7 +5170,7 @@
         </w:tc>
         <w:tc>
           <w:tcPr>
-            <w:tcW w:type="dxa" w:w="4320"/>
+            <w:tcW w:type="dxa" w:w="4824"/>
           </w:tcPr>
           <w:p>
             <w:r/>
@@ -5183,7 +5183,7 @@
       <w:tr>
         <w:tc>
           <w:tcPr>
-            <w:tcW w:type="dxa" w:w="4320"/>
+            <w:tcW w:type="dxa" w:w="4824"/>
           </w:tcPr>
           <w:p>
             <w:r/>
@@ -5194,7 +5194,7 @@
         </w:tc>
         <w:tc>
           <w:tcPr>
-            <w:tcW w:type="dxa" w:w="4320"/>
+            <w:tcW w:type="dxa" w:w="4824"/>
           </w:tcPr>
           <w:p>
             <w:r/>
@@ -5207,7 +5207,7 @@
       <w:tr>
         <w:tc>
           <w:tcPr>
-            <w:tcW w:type="dxa" w:w="4320"/>
+            <w:tcW w:type="dxa" w:w="4824"/>
           </w:tcPr>
           <w:p>
             <w:r/>
@@ -5218,7 +5218,7 @@
         </w:tc>
         <w:tc>
           <w:tcPr>
-            <w:tcW w:type="dxa" w:w="4320"/>
+            <w:tcW w:type="dxa" w:w="4824"/>
           </w:tcPr>
           <w:p>
             <w:r/>
@@ -5231,7 +5231,7 @@
       <w:tr>
         <w:tc>
           <w:tcPr>
-            <w:tcW w:type="dxa" w:w="4320"/>
+            <w:tcW w:type="dxa" w:w="4824"/>
           </w:tcPr>
           <w:p>
             <w:r/>
@@ -5242,7 +5242,7 @@
         </w:tc>
         <w:tc>
           <w:tcPr>
-            <w:tcW w:type="dxa" w:w="4320"/>
+            <w:tcW w:type="dxa" w:w="4824"/>
           </w:tcPr>
           <w:p>
             <w:r/>
@@ -5295,13 +5295,13 @@
         <w:tblLook w:firstColumn="1" w:firstRow="1" w:lastColumn="0" w:lastRow="0" w:noHBand="0" w:noVBand="1" w:val="04A0"/>
       </w:tblPr>
       <w:tblGrid>
-        <w:gridCol w:w="4320"/>
-        <w:gridCol w:w="4320"/>
+        <w:gridCol w:w="4824"/>
+        <w:gridCol w:w="4824"/>
       </w:tblGrid>
       <w:tr>
         <w:tc>
           <w:tcPr>
-            <w:tcW w:type="dxa" w:w="4320"/>
+            <w:tcW w:type="dxa" w:w="4824"/>
           </w:tcPr>
           <w:p>
             <w:r/>
@@ -5315,7 +5315,7 @@
         </w:tc>
         <w:tc>
           <w:tcPr>
-            <w:tcW w:type="dxa" w:w="4320"/>
+            <w:tcW w:type="dxa" w:w="4824"/>
           </w:tcPr>
           <w:p>
             <w:r/>
@@ -5331,7 +5331,7 @@
       <w:tr>
         <w:tc>
           <w:tcPr>
-            <w:tcW w:type="dxa" w:w="4320"/>
+            <w:tcW w:type="dxa" w:w="4824"/>
           </w:tcPr>
           <w:p>
             <w:r/>
@@ -5342,7 +5342,7 @@
         </w:tc>
         <w:tc>
           <w:tcPr>
-            <w:tcW w:type="dxa" w:w="4320"/>
+            <w:tcW w:type="dxa" w:w="4824"/>
           </w:tcPr>
           <w:p>
             <w:r/>
@@ -5361,7 +5361,7 @@
       <w:tr>
         <w:tc>
           <w:tcPr>
-            <w:tcW w:type="dxa" w:w="4320"/>
+            <w:tcW w:type="dxa" w:w="4824"/>
           </w:tcPr>
           <w:p>
             <w:r/>
@@ -5372,7 +5372,7 @@
         </w:tc>
         <w:tc>
           <w:tcPr>
-            <w:tcW w:type="dxa" w:w="4320"/>
+            <w:tcW w:type="dxa" w:w="4824"/>
           </w:tcPr>
           <w:p>
             <w:r/>
@@ -5391,7 +5391,7 @@
       <w:tr>
         <w:tc>
           <w:tcPr>
-            <w:tcW w:type="dxa" w:w="4320"/>
+            <w:tcW w:type="dxa" w:w="4824"/>
           </w:tcPr>
           <w:p>
             <w:r/>
@@ -5402,7 +5402,7 @@
         </w:tc>
         <w:tc>
           <w:tcPr>
-            <w:tcW w:type="dxa" w:w="4320"/>
+            <w:tcW w:type="dxa" w:w="4824"/>
           </w:tcPr>
           <w:p>
             <w:r/>
@@ -5418,7 +5418,7 @@
       <w:tr>
         <w:tc>
           <w:tcPr>
-            <w:tcW w:type="dxa" w:w="4320"/>
+            <w:tcW w:type="dxa" w:w="4824"/>
           </w:tcPr>
           <w:p>
             <w:r/>
@@ -5429,7 +5429,7 @@
         </w:tc>
         <w:tc>
           <w:tcPr>
-            <w:tcW w:type="dxa" w:w="4320"/>
+            <w:tcW w:type="dxa" w:w="4824"/>
           </w:tcPr>
           <w:p>
             <w:r/>
@@ -6629,14 +6629,14 @@
         <w:tblLook w:firstColumn="1" w:firstRow="1" w:lastColumn="0" w:lastRow="0" w:noHBand="0" w:noVBand="1" w:val="04A0"/>
       </w:tblPr>
       <w:tblGrid>
-        <w:gridCol w:w="2880"/>
-        <w:gridCol w:w="2880"/>
-        <w:gridCol w:w="2880"/>
+        <w:gridCol w:w="3216"/>
+        <w:gridCol w:w="3216"/>
+        <w:gridCol w:w="3216"/>
       </w:tblGrid>
       <w:tr>
         <w:tc>
           <w:tcPr>
-            <w:tcW w:type="dxa" w:w="2880"/>
+            <w:tcW w:type="dxa" w:w="3216"/>
           </w:tcPr>
           <w:p>
             <w:r/>
@@ -6650,7 +6650,7 @@
         </w:tc>
         <w:tc>
           <w:tcPr>
-            <w:tcW w:type="dxa" w:w="2880"/>
+            <w:tcW w:type="dxa" w:w="3216"/>
           </w:tcPr>
           <w:p>
             <w:r/>
@@ -6664,7 +6664,7 @@
         </w:tc>
         <w:tc>
           <w:tcPr>
-            <w:tcW w:type="dxa" w:w="2880"/>
+            <w:tcW w:type="dxa" w:w="3216"/>
           </w:tcPr>
           <w:p>
             <w:r/>
@@ -6680,7 +6680,7 @@
       <w:tr>
         <w:tc>
           <w:tcPr>
-            <w:tcW w:type="dxa" w:w="2880"/>
+            <w:tcW w:type="dxa" w:w="3216"/>
           </w:tcPr>
           <w:p>
             <w:r/>
@@ -6694,7 +6694,7 @@
         </w:tc>
         <w:tc>
           <w:tcPr>
-            <w:tcW w:type="dxa" w:w="2880"/>
+            <w:tcW w:type="dxa" w:w="3216"/>
           </w:tcPr>
           <w:p>
             <w:r/>
@@ -6705,7 +6705,7 @@
         </w:tc>
         <w:tc>
           <w:tcPr>
-            <w:tcW w:type="dxa" w:w="2880"/>
+            <w:tcW w:type="dxa" w:w="3216"/>
           </w:tcPr>
           <w:p>
             <w:r/>
@@ -6736,7 +6736,7 @@
       <w:tr>
         <w:tc>
           <w:tcPr>
-            <w:tcW w:type="dxa" w:w="2880"/>
+            <w:tcW w:type="dxa" w:w="3216"/>
           </w:tcPr>
           <w:p>
             <w:r/>
@@ -6750,7 +6750,7 @@
         </w:tc>
         <w:tc>
           <w:tcPr>
-            <w:tcW w:type="dxa" w:w="2880"/>
+            <w:tcW w:type="dxa" w:w="3216"/>
           </w:tcPr>
           <w:p>
             <w:r/>
@@ -6761,7 +6761,7 @@
         </w:tc>
         <w:tc>
           <w:tcPr>
-            <w:tcW w:type="dxa" w:w="2880"/>
+            <w:tcW w:type="dxa" w:w="3216"/>
           </w:tcPr>
           <w:p>
             <w:r/>
@@ -6783,7 +6783,7 @@
       <w:tr>
         <w:tc>
           <w:tcPr>
-            <w:tcW w:type="dxa" w:w="2880"/>
+            <w:tcW w:type="dxa" w:w="3216"/>
           </w:tcPr>
           <w:p>
             <w:r/>
@@ -6800,7 +6800,7 @@
         </w:tc>
         <w:tc>
           <w:tcPr>
-            <w:tcW w:type="dxa" w:w="2880"/>
+            <w:tcW w:type="dxa" w:w="3216"/>
           </w:tcPr>
           <w:p>
             <w:r/>
@@ -6811,7 +6811,7 @@
         </w:tc>
         <w:tc>
           <w:tcPr>
-            <w:tcW w:type="dxa" w:w="2880"/>
+            <w:tcW w:type="dxa" w:w="3216"/>
           </w:tcPr>
           <w:p>
             <w:r/>
@@ -6842,7 +6842,7 @@
       <w:tr>
         <w:tc>
           <w:tcPr>
-            <w:tcW w:type="dxa" w:w="2880"/>
+            <w:tcW w:type="dxa" w:w="3216"/>
           </w:tcPr>
           <w:p>
             <w:r/>
@@ -6859,7 +6859,7 @@
         </w:tc>
         <w:tc>
           <w:tcPr>
-            <w:tcW w:type="dxa" w:w="2880"/>
+            <w:tcW w:type="dxa" w:w="3216"/>
           </w:tcPr>
           <w:p>
             <w:r/>
@@ -6870,7 +6870,7 @@
         </w:tc>
         <w:tc>
           <w:tcPr>
-            <w:tcW w:type="dxa" w:w="2880"/>
+            <w:tcW w:type="dxa" w:w="3216"/>
           </w:tcPr>
           <w:p>
             <w:r/>
@@ -6901,7 +6901,7 @@
       <w:tr>
         <w:tc>
           <w:tcPr>
-            <w:tcW w:type="dxa" w:w="2880"/>
+            <w:tcW w:type="dxa" w:w="3216"/>
           </w:tcPr>
           <w:p>
             <w:r/>
@@ -6918,7 +6918,7 @@
         </w:tc>
         <w:tc>
           <w:tcPr>
-            <w:tcW w:type="dxa" w:w="2880"/>
+            <w:tcW w:type="dxa" w:w="3216"/>
           </w:tcPr>
           <w:p>
             <w:r/>
@@ -6929,7 +6929,7 @@
         </w:tc>
         <w:tc>
           <w:tcPr>
-            <w:tcW w:type="dxa" w:w="2880"/>
+            <w:tcW w:type="dxa" w:w="3216"/>
           </w:tcPr>
           <w:p>
             <w:r/>
@@ -6942,7 +6942,7 @@
       <w:tr>
         <w:tc>
           <w:tcPr>
-            <w:tcW w:type="dxa" w:w="2880"/>
+            <w:tcW w:type="dxa" w:w="3216"/>
           </w:tcPr>
           <w:p>
             <w:r/>
@@ -6959,7 +6959,7 @@
         </w:tc>
         <w:tc>
           <w:tcPr>
-            <w:tcW w:type="dxa" w:w="2880"/>
+            <w:tcW w:type="dxa" w:w="3216"/>
           </w:tcPr>
           <w:p>
             <w:r/>
@@ -6970,7 +6970,7 @@
         </w:tc>
         <w:tc>
           <w:tcPr>
-            <w:tcW w:type="dxa" w:w="2880"/>
+            <w:tcW w:type="dxa" w:w="3216"/>
           </w:tcPr>
           <w:p>
             <w:r/>
@@ -6983,7 +6983,7 @@
       <w:tr>
         <w:tc>
           <w:tcPr>
-            <w:tcW w:type="dxa" w:w="2880"/>
+            <w:tcW w:type="dxa" w:w="3216"/>
           </w:tcPr>
           <w:p>
             <w:r/>
@@ -7000,7 +7000,7 @@
         </w:tc>
         <w:tc>
           <w:tcPr>
-            <w:tcW w:type="dxa" w:w="2880"/>
+            <w:tcW w:type="dxa" w:w="3216"/>
           </w:tcPr>
           <w:p>
             <w:r/>
@@ -7011,7 +7011,7 @@
         </w:tc>
         <w:tc>
           <w:tcPr>
-            <w:tcW w:type="dxa" w:w="2880"/>
+            <w:tcW w:type="dxa" w:w="3216"/>
           </w:tcPr>
           <w:p>
             <w:r/>
@@ -7691,14 +7691,14 @@
         <w:tblLook w:firstColumn="1" w:firstRow="1" w:lastColumn="0" w:lastRow="0" w:noHBand="0" w:noVBand="1" w:val="04A0"/>
       </w:tblPr>
       <w:tblGrid>
-        <w:gridCol w:w="2880"/>
-        <w:gridCol w:w="2880"/>
-        <w:gridCol w:w="2880"/>
+        <w:gridCol w:w="3216"/>
+        <w:gridCol w:w="3216"/>
+        <w:gridCol w:w="3216"/>
       </w:tblGrid>
       <w:tr>
         <w:tc>
           <w:tcPr>
-            <w:tcW w:type="dxa" w:w="2880"/>
+            <w:tcW w:type="dxa" w:w="3216"/>
           </w:tcPr>
           <w:p>
             <w:r/>
@@ -7712,7 +7712,7 @@
         </w:tc>
         <w:tc>
           <w:tcPr>
-            <w:tcW w:type="dxa" w:w="2880"/>
+            <w:tcW w:type="dxa" w:w="3216"/>
           </w:tcPr>
           <w:p>
             <w:r/>
@@ -7726,7 +7726,7 @@
         </w:tc>
         <w:tc>
           <w:tcPr>
-            <w:tcW w:type="dxa" w:w="2880"/>
+            <w:tcW w:type="dxa" w:w="3216"/>
           </w:tcPr>
           <w:p>
             <w:r/>
@@ -7742,7 +7742,7 @@
       <w:tr>
         <w:tc>
           <w:tcPr>
-            <w:tcW w:type="dxa" w:w="2880"/>
+            <w:tcW w:type="dxa" w:w="3216"/>
           </w:tcPr>
           <w:p>
             <w:r/>
@@ -7756,7 +7756,7 @@
         </w:tc>
         <w:tc>
           <w:tcPr>
-            <w:tcW w:type="dxa" w:w="2880"/>
+            <w:tcW w:type="dxa" w:w="3216"/>
           </w:tcPr>
           <w:p>
             <w:r/>
@@ -7767,7 +7767,7 @@
         </w:tc>
         <w:tc>
           <w:tcPr>
-            <w:tcW w:type="dxa" w:w="2880"/>
+            <w:tcW w:type="dxa" w:w="3216"/>
           </w:tcPr>
           <w:p>
             <w:r/>
@@ -7780,7 +7780,7 @@
       <w:tr>
         <w:tc>
           <w:tcPr>
-            <w:tcW w:type="dxa" w:w="2880"/>
+            <w:tcW w:type="dxa" w:w="3216"/>
           </w:tcPr>
           <w:p>
             <w:r/>
@@ -7797,7 +7797,7 @@
         </w:tc>
         <w:tc>
           <w:tcPr>
-            <w:tcW w:type="dxa" w:w="2880"/>
+            <w:tcW w:type="dxa" w:w="3216"/>
           </w:tcPr>
           <w:p>
             <w:r/>
@@ -7808,7 +7808,7 @@
         </w:tc>
         <w:tc>
           <w:tcPr>
-            <w:tcW w:type="dxa" w:w="2880"/>
+            <w:tcW w:type="dxa" w:w="3216"/>
           </w:tcPr>
           <w:p>
             <w:r/>
@@ -7821,7 +7821,7 @@
       <w:tr>
         <w:tc>
           <w:tcPr>
-            <w:tcW w:type="dxa" w:w="2880"/>
+            <w:tcW w:type="dxa" w:w="3216"/>
           </w:tcPr>
           <w:p>
             <w:r/>
@@ -7838,7 +7838,7 @@
         </w:tc>
         <w:tc>
           <w:tcPr>
-            <w:tcW w:type="dxa" w:w="2880"/>
+            <w:tcW w:type="dxa" w:w="3216"/>
           </w:tcPr>
           <w:p>
             <w:r/>
@@ -7849,7 +7849,7 @@
         </w:tc>
         <w:tc>
           <w:tcPr>
-            <w:tcW w:type="dxa" w:w="2880"/>
+            <w:tcW w:type="dxa" w:w="3216"/>
           </w:tcPr>
           <w:p>
             <w:r/>
@@ -7862,7 +7862,7 @@
       <w:tr>
         <w:tc>
           <w:tcPr>
-            <w:tcW w:type="dxa" w:w="2880"/>
+            <w:tcW w:type="dxa" w:w="3216"/>
           </w:tcPr>
           <w:p>
             <w:r/>
@@ -7876,7 +7876,7 @@
         </w:tc>
         <w:tc>
           <w:tcPr>
-            <w:tcW w:type="dxa" w:w="2880"/>
+            <w:tcW w:type="dxa" w:w="3216"/>
           </w:tcPr>
           <w:p>
             <w:r/>
@@ -7887,7 +7887,7 @@
         </w:tc>
         <w:tc>
           <w:tcPr>
-            <w:tcW w:type="dxa" w:w="2880"/>
+            <w:tcW w:type="dxa" w:w="3216"/>
           </w:tcPr>
           <w:p>
             <w:r/>
@@ -7900,7 +7900,7 @@
       <w:tr>
         <w:tc>
           <w:tcPr>
-            <w:tcW w:type="dxa" w:w="2880"/>
+            <w:tcW w:type="dxa" w:w="3216"/>
           </w:tcPr>
           <w:p>
             <w:r/>
@@ -7917,7 +7917,7 @@
         </w:tc>
         <w:tc>
           <w:tcPr>
-            <w:tcW w:type="dxa" w:w="2880"/>
+            <w:tcW w:type="dxa" w:w="3216"/>
           </w:tcPr>
           <w:p>
             <w:r/>
@@ -7928,7 +7928,7 @@
         </w:tc>
         <w:tc>
           <w:tcPr>
-            <w:tcW w:type="dxa" w:w="2880"/>
+            <w:tcW w:type="dxa" w:w="3216"/>
           </w:tcPr>
           <w:p>
             <w:r/>
@@ -8209,13 +8209,13 @@
         <w:tblLook w:firstColumn="1" w:firstRow="1" w:lastColumn="0" w:lastRow="0" w:noHBand="0" w:noVBand="1" w:val="04A0"/>
       </w:tblPr>
       <w:tblGrid>
-        <w:gridCol w:w="4320"/>
-        <w:gridCol w:w="4320"/>
+        <w:gridCol w:w="4824"/>
+        <w:gridCol w:w="4824"/>
       </w:tblGrid>
       <w:tr>
         <w:tc>
           <w:tcPr>
-            <w:tcW w:type="dxa" w:w="4320"/>
+            <w:tcW w:type="dxa" w:w="4824"/>
           </w:tcPr>
           <w:p>
             <w:r/>
@@ -8229,7 +8229,7 @@
         </w:tc>
         <w:tc>
           <w:tcPr>
-            <w:tcW w:type="dxa" w:w="4320"/>
+            <w:tcW w:type="dxa" w:w="4824"/>
           </w:tcPr>
           <w:p>
             <w:r/>
@@ -8245,7 +8245,7 @@
       <w:tr>
         <w:tc>
           <w:tcPr>
-            <w:tcW w:type="dxa" w:w="4320"/>
+            <w:tcW w:type="dxa" w:w="4824"/>
           </w:tcPr>
           <w:p>
             <w:r/>
@@ -8256,7 +8256,7 @@
         </w:tc>
         <w:tc>
           <w:tcPr>
-            <w:tcW w:type="dxa" w:w="4320"/>
+            <w:tcW w:type="dxa" w:w="4824"/>
           </w:tcPr>
           <w:p>
             <w:r/>
@@ -8278,7 +8278,7 @@
       <w:tr>
         <w:tc>
           <w:tcPr>
-            <w:tcW w:type="dxa" w:w="4320"/>
+            <w:tcW w:type="dxa" w:w="4824"/>
           </w:tcPr>
           <w:p>
             <w:r/>
@@ -8289,7 +8289,7 @@
         </w:tc>
         <w:tc>
           <w:tcPr>
-            <w:tcW w:type="dxa" w:w="4320"/>
+            <w:tcW w:type="dxa" w:w="4824"/>
           </w:tcPr>
           <w:p>
             <w:r/>
@@ -8329,7 +8329,7 @@
       <w:tr>
         <w:tc>
           <w:tcPr>
-            <w:tcW w:type="dxa" w:w="4320"/>
+            <w:tcW w:type="dxa" w:w="4824"/>
           </w:tcPr>
           <w:p>
             <w:r/>
@@ -8340,7 +8340,7 @@
         </w:tc>
         <w:tc>
           <w:tcPr>
-            <w:tcW w:type="dxa" w:w="4320"/>
+            <w:tcW w:type="dxa" w:w="4824"/>
           </w:tcPr>
           <w:p>
             <w:r/>
@@ -8353,7 +8353,7 @@
       <w:tr>
         <w:tc>
           <w:tcPr>
-            <w:tcW w:type="dxa" w:w="4320"/>
+            <w:tcW w:type="dxa" w:w="4824"/>
           </w:tcPr>
           <w:p>
             <w:r/>
@@ -8364,7 +8364,7 @@
         </w:tc>
         <w:tc>
           <w:tcPr>
-            <w:tcW w:type="dxa" w:w="4320"/>
+            <w:tcW w:type="dxa" w:w="4824"/>
           </w:tcPr>
           <w:p>
             <w:r/>
@@ -8386,7 +8386,7 @@
       <w:tr>
         <w:tc>
           <w:tcPr>
-            <w:tcW w:type="dxa" w:w="4320"/>
+            <w:tcW w:type="dxa" w:w="4824"/>
           </w:tcPr>
           <w:p>
             <w:r/>
@@ -8397,7 +8397,7 @@
         </w:tc>
         <w:tc>
           <w:tcPr>
-            <w:tcW w:type="dxa" w:w="4320"/>
+            <w:tcW w:type="dxa" w:w="4824"/>
           </w:tcPr>
           <w:p>
             <w:r/>
@@ -8419,7 +8419,7 @@
       <w:tr>
         <w:tc>
           <w:tcPr>
-            <w:tcW w:type="dxa" w:w="4320"/>
+            <w:tcW w:type="dxa" w:w="4824"/>
           </w:tcPr>
           <w:p>
             <w:r/>
@@ -8430,7 +8430,7 @@
         </w:tc>
         <w:tc>
           <w:tcPr>
-            <w:tcW w:type="dxa" w:w="4320"/>
+            <w:tcW w:type="dxa" w:w="4824"/>
           </w:tcPr>
           <w:p>
             <w:r/>
@@ -8461,7 +8461,7 @@
       <w:tr>
         <w:tc>
           <w:tcPr>
-            <w:tcW w:type="dxa" w:w="4320"/>
+            <w:tcW w:type="dxa" w:w="4824"/>
           </w:tcPr>
           <w:p>
             <w:r/>
@@ -8472,7 +8472,7 @@
         </w:tc>
         <w:tc>
           <w:tcPr>
-            <w:tcW w:type="dxa" w:w="4320"/>
+            <w:tcW w:type="dxa" w:w="4824"/>
           </w:tcPr>
           <w:p>
             <w:r/>
@@ -8485,7 +8485,7 @@
       <w:tr>
         <w:tc>
           <w:tcPr>
-            <w:tcW w:type="dxa" w:w="4320"/>
+            <w:tcW w:type="dxa" w:w="4824"/>
           </w:tcPr>
           <w:p>
             <w:r/>
@@ -8496,7 +8496,7 @@
         </w:tc>
         <w:tc>
           <w:tcPr>
-            <w:tcW w:type="dxa" w:w="4320"/>
+            <w:tcW w:type="dxa" w:w="4824"/>
           </w:tcPr>
           <w:p>
             <w:r/>
@@ -8518,7 +8518,7 @@
       <w:tr>
         <w:tc>
           <w:tcPr>
-            <w:tcW w:type="dxa" w:w="4320"/>
+            <w:tcW w:type="dxa" w:w="4824"/>
           </w:tcPr>
           <w:p>
             <w:r/>
@@ -8529,7 +8529,7 @@
         </w:tc>
         <w:tc>
           <w:tcPr>
-            <w:tcW w:type="dxa" w:w="4320"/>
+            <w:tcW w:type="dxa" w:w="4824"/>
           </w:tcPr>
           <w:p>
             <w:r/>
@@ -8551,7 +8551,7 @@
       <w:tr>
         <w:tc>
           <w:tcPr>
-            <w:tcW w:type="dxa" w:w="4320"/>
+            <w:tcW w:type="dxa" w:w="4824"/>
           </w:tcPr>
           <w:p>
             <w:r/>
@@ -8562,7 +8562,7 @@
         </w:tc>
         <w:tc>
           <w:tcPr>
-            <w:tcW w:type="dxa" w:w="4320"/>
+            <w:tcW w:type="dxa" w:w="4824"/>
           </w:tcPr>
           <w:p>
             <w:r/>
@@ -8575,7 +8575,7 @@
       <w:tr>
         <w:tc>
           <w:tcPr>
-            <w:tcW w:type="dxa" w:w="4320"/>
+            <w:tcW w:type="dxa" w:w="4824"/>
           </w:tcPr>
           <w:p>
             <w:r/>
@@ -8586,7 +8586,7 @@
         </w:tc>
         <w:tc>
           <w:tcPr>
-            <w:tcW w:type="dxa" w:w="4320"/>
+            <w:tcW w:type="dxa" w:w="4824"/>
           </w:tcPr>
           <w:p>
             <w:r/>
@@ -8599,7 +8599,7 @@
       <w:tr>
         <w:tc>
           <w:tcPr>
-            <w:tcW w:type="dxa" w:w="4320"/>
+            <w:tcW w:type="dxa" w:w="4824"/>
           </w:tcPr>
           <w:p>
             <w:r/>
@@ -8610,7 +8610,7 @@
         </w:tc>
         <w:tc>
           <w:tcPr>
-            <w:tcW w:type="dxa" w:w="4320"/>
+            <w:tcW w:type="dxa" w:w="4824"/>
           </w:tcPr>
           <w:p>
             <w:r/>
@@ -8939,7 +8939,7 @@
     </w:p>
     <w:sectPr>
       <w:pgSz w:w="12240" w:h="15840"/>
-      <w:pgMar w:top="1440" w:right="1800" w:bottom="1440" w:left="1800" w:header="720" w:footer="720" w:gutter="0"/>
+      <w:pgMar w:top="1152" w:right="1296" w:bottom="1152" w:left="1296" w:header="720" w:footer="720" w:gutter="0"/>
       <w:cols w:space="720"/>
       <w:docGrid w:linePitch="360"/>
     </w:sectPr>

</xml_diff>